<commit_message>
new: week 2 Question 5 implemented
</commit_message>
<xml_diff>
--- a/networking-assessment/week_2.docx
+++ b/networking-assessment/week_2.docx
@@ -506,21 +506,7 @@
         <w:rPr>
           <w:rFonts w:ascii="Arial" w:hAnsi="Arial" w:cs="Arial"/>
         </w:rPr>
-        <w:t xml:space="preserve">Now let me ping system PC0 to system PC1. Table will now take the </w:t>
-      </w:r>
-      <w:proofErr w:type="spellStart"/>
-      <w:r>
-        <w:rPr>
-          <w:rFonts w:ascii="Arial" w:hAnsi="Arial" w:cs="Arial"/>
-        </w:rPr>
-        <w:t>src</w:t>
-      </w:r>
-      <w:proofErr w:type="spellEnd"/>
-      <w:r>
-        <w:rPr>
-          <w:rFonts w:ascii="Arial" w:hAnsi="Arial" w:cs="Arial"/>
-        </w:rPr>
-        <w:t xml:space="preserve"> MAC from that packet and update the table.</w:t>
+        <w:t>Now let me ping system PC0 to system PC1. Table will now take the src MAC from that packet and update the table.</w:t>
       </w:r>
     </w:p>
     <w:p>
@@ -1177,62 +1163,13 @@
         <w:rPr>
           <w:rFonts w:ascii="Arial" w:hAnsi="Arial" w:cs="Arial"/>
         </w:rPr>
-        <w:t xml:space="preserve">The </w:t>
-      </w:r>
-      <w:proofErr w:type="spellStart"/>
-      <w:r>
-        <w:rPr>
-          <w:rFonts w:ascii="Arial" w:hAnsi="Arial" w:cs="Arial"/>
-        </w:rPr>
-        <w:t>src</w:t>
-      </w:r>
-      <w:proofErr w:type="spellEnd"/>
-      <w:r>
-        <w:rPr>
-          <w:rFonts w:ascii="Arial" w:hAnsi="Arial" w:cs="Arial"/>
-        </w:rPr>
-        <w:t xml:space="preserve"> MAC address is </w:t>
-      </w:r>
-      <w:proofErr w:type="gramStart"/>
-      <w:r>
-        <w:rPr>
-          <w:rFonts w:ascii="Arial" w:hAnsi="Arial" w:cs="Arial"/>
-        </w:rPr>
-        <w:t>ea:d</w:t>
-      </w:r>
-      <w:proofErr w:type="gramEnd"/>
-      <w:r>
-        <w:rPr>
-          <w:rFonts w:ascii="Arial" w:hAnsi="Arial" w:cs="Arial"/>
-        </w:rPr>
-        <w:t>7:ca:</w:t>
-      </w:r>
-      <w:proofErr w:type="gramStart"/>
-      <w:r>
-        <w:rPr>
-          <w:rFonts w:ascii="Arial" w:hAnsi="Arial" w:cs="Arial"/>
-        </w:rPr>
-        <w:t>66:aa</w:t>
-      </w:r>
-      <w:proofErr w:type="gramEnd"/>
-      <w:r>
-        <w:rPr>
-          <w:rFonts w:ascii="Arial" w:hAnsi="Arial" w:cs="Arial"/>
-        </w:rPr>
-        <w:t xml:space="preserve">:be and the des MAC address is </w:t>
-      </w:r>
-      <w:r>
-        <w:rPr>
-          <w:rFonts w:ascii="Arial" w:hAnsi="Arial" w:cs="Arial"/>
-        </w:rPr>
-        <w:t>4</w:t>
-      </w:r>
-      <w:proofErr w:type="gramStart"/>
-      <w:r>
-        <w:rPr>
-          <w:rFonts w:ascii="Arial" w:hAnsi="Arial" w:cs="Arial"/>
-        </w:rPr>
-        <w:t>c</w:t>
+        <w:t xml:space="preserve">The src MAC address is ea:d7:ca:66:aa:be and the des MAC address is </w:t>
+      </w:r>
+      <w:r>
+        <w:rPr>
+          <w:rFonts w:ascii="Arial" w:hAnsi="Arial" w:cs="Arial"/>
+        </w:rPr>
+        <w:t>4c</w:t>
       </w:r>
       <w:r>
         <w:rPr>
@@ -1292,34 +1229,13 @@
         <w:rPr>
           <w:rFonts w:ascii="Arial" w:hAnsi="Arial" w:cs="Arial"/>
         </w:rPr>
-        <w:t>7</w:t>
-      </w:r>
-      <w:proofErr w:type="gramEnd"/>
-      <w:r>
-        <w:rPr>
-          <w:rFonts w:ascii="Arial" w:hAnsi="Arial" w:cs="Arial"/>
-        </w:rPr>
-        <w:t>b</w:t>
-      </w:r>
-      <w:r>
-        <w:rPr>
-          <w:rFonts w:ascii="Arial" w:hAnsi="Arial" w:cs="Arial"/>
-        </w:rPr>
-        <w:t xml:space="preserve"> (my </w:t>
-      </w:r>
-      <w:proofErr w:type="spellStart"/>
-      <w:r>
-        <w:rPr>
-          <w:rFonts w:ascii="Arial" w:hAnsi="Arial" w:cs="Arial"/>
-        </w:rPr>
-        <w:t>WiFi</w:t>
-      </w:r>
-      <w:proofErr w:type="spellEnd"/>
-      <w:r>
-        <w:rPr>
-          <w:rFonts w:ascii="Arial" w:hAnsi="Arial" w:cs="Arial"/>
-        </w:rPr>
-        <w:t xml:space="preserve"> card MAC Address)</w:t>
+        <w:t>7b</w:t>
+      </w:r>
+      <w:r>
+        <w:rPr>
+          <w:rFonts w:ascii="Arial" w:hAnsi="Arial" w:cs="Arial"/>
+        </w:rPr>
+        <w:t xml:space="preserve"> (my WiFi card MAC Address)</w:t>
       </w:r>
     </w:p>
     <w:p>
@@ -1339,19 +1255,11 @@
         </w:rPr>
         <w:t xml:space="preserve">From the OUI ID we can say the MAC address of </w:t>
       </w:r>
-      <w:proofErr w:type="spellStart"/>
-      <w:r>
-        <w:rPr>
-          <w:rFonts w:ascii="Arial" w:hAnsi="Arial" w:cs="Arial"/>
-        </w:rPr>
-        <w:t>dst</w:t>
-      </w:r>
-      <w:proofErr w:type="spellEnd"/>
-      <w:r>
-        <w:rPr>
-          <w:rFonts w:ascii="Arial" w:hAnsi="Arial" w:cs="Arial"/>
-        </w:rPr>
-        <w:t xml:space="preserve"> </w:t>
+      <w:r>
+        <w:rPr>
+          <w:rFonts w:ascii="Arial" w:hAnsi="Arial" w:cs="Arial"/>
+        </w:rPr>
+        <w:t xml:space="preserve">dst </w:t>
       </w:r>
       <w:r>
         <w:rPr>
@@ -1375,21 +1283,7 @@
         <w:rPr>
           <w:rFonts w:ascii="Arial" w:hAnsi="Arial" w:cs="Arial"/>
         </w:rPr>
-        <w:t xml:space="preserve">The </w:t>
-      </w:r>
-      <w:proofErr w:type="spellStart"/>
-      <w:r>
-        <w:rPr>
-          <w:rFonts w:ascii="Arial" w:hAnsi="Arial" w:cs="Arial"/>
-        </w:rPr>
-        <w:t>dst</w:t>
-      </w:r>
-      <w:proofErr w:type="spellEnd"/>
-      <w:r>
-        <w:rPr>
-          <w:rFonts w:ascii="Arial" w:hAnsi="Arial" w:cs="Arial"/>
-        </w:rPr>
-        <w:t xml:space="preserve"> MAC address First 3 blocks </w:t>
+        <w:t xml:space="preserve">The dst MAC address First 3 blocks </w:t>
       </w:r>
       <w:r>
         <w:rPr>
@@ -1728,33 +1622,11 @@
         </w:rPr>
         <w:t xml:space="preserve">: </w:t>
       </w:r>
-      <w:proofErr w:type="gramStart"/>
-      <w:r>
-        <w:rPr>
-          <w:rFonts w:ascii="Arial" w:hAnsi="Arial" w:cs="Arial"/>
-        </w:rPr>
-        <w:t>ea:d</w:t>
-      </w:r>
-      <w:proofErr w:type="gramEnd"/>
-      <w:r>
-        <w:rPr>
-          <w:rFonts w:ascii="Arial" w:hAnsi="Arial" w:cs="Arial"/>
-        </w:rPr>
-        <w:t>7:ca:</w:t>
-      </w:r>
-      <w:proofErr w:type="gramStart"/>
-      <w:r>
-        <w:rPr>
-          <w:rFonts w:ascii="Arial" w:hAnsi="Arial" w:cs="Arial"/>
-        </w:rPr>
-        <w:t>66:aa</w:t>
-      </w:r>
-      <w:proofErr w:type="gramEnd"/>
-      <w:r>
-        <w:rPr>
-          <w:rFonts w:ascii="Arial" w:hAnsi="Arial" w:cs="Arial"/>
-        </w:rPr>
-        <w:t>:be</w:t>
+      <w:r>
+        <w:rPr>
+          <w:rFonts w:ascii="Arial" w:hAnsi="Arial" w:cs="Arial"/>
+        </w:rPr>
+        <w:t>ea:d7:ca:66:aa:be</w:t>
       </w:r>
     </w:p>
     <w:p>
@@ -1786,21 +1658,7 @@
         <w:rPr>
           <w:rFonts w:ascii="Arial" w:hAnsi="Arial" w:cs="Arial"/>
         </w:rPr>
-        <w:t>4</w:t>
-      </w:r>
-      <w:proofErr w:type="gramStart"/>
-      <w:r>
-        <w:rPr>
-          <w:rFonts w:ascii="Arial" w:hAnsi="Arial" w:cs="Arial"/>
-        </w:rPr>
-        <w:t>c:49:6c:55:61:7</w:t>
-      </w:r>
-      <w:proofErr w:type="gramEnd"/>
-      <w:r>
-        <w:rPr>
-          <w:rFonts w:ascii="Arial" w:hAnsi="Arial" w:cs="Arial"/>
-        </w:rPr>
-        <w:t>b</w:t>
+        <w:t>4c:49:6c:55:61:7b</w:t>
       </w:r>
     </w:p>
     <w:p>
@@ -1893,49 +1751,7 @@
         <w:rPr>
           <w:rFonts w:ascii="Arial" w:hAnsi="Arial" w:cs="Arial"/>
         </w:rPr>
-        <w:t xml:space="preserve">0000   </w:t>
-      </w:r>
-      <w:proofErr w:type="spellStart"/>
-      <w:r>
-        <w:rPr>
-          <w:rFonts w:ascii="Arial" w:hAnsi="Arial" w:cs="Arial"/>
-        </w:rPr>
-        <w:t>ea</w:t>
-      </w:r>
-      <w:proofErr w:type="spellEnd"/>
-      <w:r>
-        <w:rPr>
-          <w:rFonts w:ascii="Arial" w:hAnsi="Arial" w:cs="Arial"/>
-        </w:rPr>
-        <w:t xml:space="preserve"> d7 ca 66 aa be 4c 49 6c 55 61 7b 08 00 45 00   ...</w:t>
-      </w:r>
-      <w:proofErr w:type="gramStart"/>
-      <w:r>
-        <w:rPr>
-          <w:rFonts w:ascii="Arial" w:hAnsi="Arial" w:cs="Arial"/>
-        </w:rPr>
-        <w:t>f..</w:t>
-      </w:r>
-      <w:proofErr w:type="spellStart"/>
-      <w:r>
-        <w:rPr>
-          <w:rFonts w:ascii="Arial" w:hAnsi="Arial" w:cs="Arial"/>
-        </w:rPr>
-        <w:t>LIlUa</w:t>
-      </w:r>
-      <w:proofErr w:type="spellEnd"/>
-      <w:r>
-        <w:rPr>
-          <w:rFonts w:ascii="Arial" w:hAnsi="Arial" w:cs="Arial"/>
-        </w:rPr>
-        <w:t>{..</w:t>
-      </w:r>
-      <w:proofErr w:type="gramEnd"/>
-      <w:r>
-        <w:rPr>
-          <w:rFonts w:ascii="Arial" w:hAnsi="Arial" w:cs="Arial"/>
-        </w:rPr>
-        <w:t>E.</w:t>
+        <w:t>0000   ea d7 ca 66 aa be 4c 49 6c 55 61 7b 08 00 45 00   ...f..LIlUa{..E.</w:t>
       </w:r>
     </w:p>
     <w:p>
@@ -1949,30 +1765,8 @@
         <w:rPr>
           <w:rFonts w:ascii="Arial" w:hAnsi="Arial" w:cs="Arial"/>
         </w:rPr>
-        <w:t xml:space="preserve">0010   00 3c 78 c9 00 00 80 01 00 00 0a 6a be 32 a2 9f </w:t>
-      </w:r>
-      <w:proofErr w:type="gramStart"/>
-      <w:r>
-        <w:rPr>
-          <w:rFonts w:ascii="Arial" w:hAnsi="Arial" w:cs="Arial"/>
-        </w:rPr>
-        <w:t xml:space="preserve">  .</w:t>
-      </w:r>
-      <w:proofErr w:type="gramEnd"/>
-      <w:r>
-        <w:rPr>
-          <w:rFonts w:ascii="Arial" w:hAnsi="Arial" w:cs="Arial"/>
-        </w:rPr>
-        <w:t>&lt;x........j.</w:t>
-      </w:r>
-      <w:proofErr w:type="gramStart"/>
-      <w:r>
-        <w:rPr>
-          <w:rFonts w:ascii="Arial" w:hAnsi="Arial" w:cs="Arial"/>
-        </w:rPr>
-        <w:t>2..</w:t>
-      </w:r>
-      <w:proofErr w:type="gramEnd"/>
+        <w:t>0010   00 3c 78 c9 00 00 80 01 00 00 0a 6a be 32 a2 9f   .&lt;x........j.2..</w:t>
+      </w:r>
     </w:p>
     <w:p>
       <w:pPr>
@@ -1985,21 +1779,7 @@
         <w:rPr>
           <w:rFonts w:ascii="Arial" w:hAnsi="Arial" w:cs="Arial"/>
         </w:rPr>
-        <w:t xml:space="preserve">0020   88 36 08 00 4d 2b 00 01 00 30 61 62 63 64 65 66 </w:t>
-      </w:r>
-      <w:proofErr w:type="gramStart"/>
-      <w:r>
-        <w:rPr>
-          <w:rFonts w:ascii="Arial" w:hAnsi="Arial" w:cs="Arial"/>
-        </w:rPr>
-        <w:t xml:space="preserve">  .6..</w:t>
-      </w:r>
-      <w:proofErr w:type="gramEnd"/>
-      <w:r>
-        <w:rPr>
-          <w:rFonts w:ascii="Arial" w:hAnsi="Arial" w:cs="Arial"/>
-        </w:rPr>
-        <w:t>M+...0abcdef</w:t>
+        <w:t>0020   88 36 08 00 4d 2b 00 01 00 30 61 62 63 64 65 66   .6..M+...0abcdef</w:t>
       </w:r>
     </w:p>
     <w:p>
@@ -2013,16 +1793,8 @@
         <w:rPr>
           <w:rFonts w:ascii="Arial" w:hAnsi="Arial" w:cs="Arial"/>
         </w:rPr>
-        <w:t xml:space="preserve">0030   67 68 69 6a 6b 6c 6d 6e 6f 70 71 72 73 74 75 76   </w:t>
-      </w:r>
-      <w:proofErr w:type="spellStart"/>
-      <w:r>
-        <w:rPr>
-          <w:rFonts w:ascii="Arial" w:hAnsi="Arial" w:cs="Arial"/>
-        </w:rPr>
-        <w:t>ghijklmnopqrstuv</w:t>
-      </w:r>
-      <w:proofErr w:type="spellEnd"/>
+        <w:t>0030   67 68 69 6a 6b 6c 6d 6e 6f 70 71 72 73 74 75 76   ghijklmnopqrstuv</w:t>
+      </w:r>
     </w:p>
     <w:p>
       <w:pPr>
@@ -2035,16 +1807,8 @@
         <w:rPr>
           <w:rFonts w:ascii="Arial" w:hAnsi="Arial" w:cs="Arial"/>
         </w:rPr>
-        <w:t xml:space="preserve">0040   77 61 62 63 64 65 66 67 68 69                     </w:t>
-      </w:r>
-      <w:proofErr w:type="spellStart"/>
-      <w:r>
-        <w:rPr>
-          <w:rFonts w:ascii="Arial" w:hAnsi="Arial" w:cs="Arial"/>
-        </w:rPr>
-        <w:t>wabcdefghi</w:t>
-      </w:r>
-      <w:proofErr w:type="spellEnd"/>
+        <w:t>0040   77 61 62 63 64 65 66 67 68 69                     wabcdefghi</w:t>
+      </w:r>
     </w:p>
     <w:p>
       <w:pPr>
@@ -2080,44 +1844,8 @@
         <w:rPr>
           <w:rFonts w:ascii="Arial" w:hAnsi="Arial" w:cs="Arial"/>
         </w:rPr>
-        <w:t xml:space="preserve">0000   </w:t>
-      </w:r>
-      <w:proofErr w:type="spellStart"/>
-      <w:r>
-        <w:rPr>
-          <w:rFonts w:ascii="Arial" w:hAnsi="Arial" w:cs="Arial"/>
-        </w:rPr>
-        <w:t>ea</w:t>
-      </w:r>
-      <w:proofErr w:type="spellEnd"/>
-      <w:r>
-        <w:rPr>
-          <w:rFonts w:ascii="Arial" w:hAnsi="Arial" w:cs="Arial"/>
-        </w:rPr>
-        <w:t xml:space="preserve"> d7 ca 66 aa be 4c 49 6c 55 61 7b 08 00         ...</w:t>
-      </w:r>
-      <w:proofErr w:type="gramStart"/>
-      <w:r>
-        <w:rPr>
-          <w:rFonts w:ascii="Arial" w:hAnsi="Arial" w:cs="Arial"/>
-        </w:rPr>
-        <w:t>f..</w:t>
-      </w:r>
-      <w:proofErr w:type="spellStart"/>
-      <w:r>
-        <w:rPr>
-          <w:rFonts w:ascii="Arial" w:hAnsi="Arial" w:cs="Arial"/>
-        </w:rPr>
-        <w:t>LIlUa</w:t>
-      </w:r>
-      <w:proofErr w:type="spellEnd"/>
-      <w:r>
-        <w:rPr>
-          <w:rFonts w:ascii="Arial" w:hAnsi="Arial" w:cs="Arial"/>
-        </w:rPr>
-        <w:t>{..</w:t>
-      </w:r>
-      <w:proofErr w:type="gramEnd"/>
+        <w:t>0000   ea d7 ca 66 aa be 4c 49 6c 55 61 7b 08 00         ...f..LIlUa{..</w:t>
+      </w:r>
     </w:p>
     <w:p>
       <w:pPr>
@@ -2146,16 +1874,8 @@
         <w:rPr>
           <w:rFonts w:ascii="Arial" w:hAnsi="Arial" w:cs="Arial"/>
         </w:rPr>
-        <w:t xml:space="preserve">0000   61 62 63 64 65 66 67 68 69 6a 6b 6c 6d 6e 6f 70   </w:t>
-      </w:r>
-      <w:proofErr w:type="spellStart"/>
-      <w:r>
-        <w:rPr>
-          <w:rFonts w:ascii="Arial" w:hAnsi="Arial" w:cs="Arial"/>
-        </w:rPr>
-        <w:t>abcdefghijklmnop</w:t>
-      </w:r>
-      <w:proofErr w:type="spellEnd"/>
+        <w:t>0000   61 62 63 64 65 66 67 68 69 6a 6b 6c 6d 6e 6f 70   abcdefghijklmnop</w:t>
+      </w:r>
     </w:p>
     <w:p>
       <w:pPr>
@@ -2168,16 +1888,8 @@
         <w:rPr>
           <w:rFonts w:ascii="Arial" w:hAnsi="Arial" w:cs="Arial"/>
         </w:rPr>
-        <w:t xml:space="preserve">0010   71 72 73 74 75 76 77 61 62 63 64 65 66 67 68 69   </w:t>
-      </w:r>
-      <w:proofErr w:type="spellStart"/>
-      <w:r>
-        <w:rPr>
-          <w:rFonts w:ascii="Arial" w:hAnsi="Arial" w:cs="Arial"/>
-        </w:rPr>
-        <w:t>qrstuvwabcdefghi</w:t>
-      </w:r>
-      <w:proofErr w:type="spellEnd"/>
+        <w:t>0010   71 72 73 74 75 76 77 61 62 63 64 65 66 67 68 69   qrstuvwabcdefghi</w:t>
+      </w:r>
     </w:p>
     <w:p>
       <w:pPr>
@@ -2527,21 +2239,7 @@
           <w:rFonts w:ascii="Arial" w:hAnsi="Arial" w:cs="Arial"/>
         </w:rPr>
         <w:lastRenderedPageBreak/>
-        <w:t xml:space="preserve">3) Configure Static IP address, modify MAC address, and verify network connectivity using ping and </w:t>
-      </w:r>
-      <w:proofErr w:type="spellStart"/>
-      <w:r>
-        <w:rPr>
-          <w:rFonts w:ascii="Arial" w:hAnsi="Arial" w:cs="Arial"/>
-        </w:rPr>
-        <w:t>ifconfig</w:t>
-      </w:r>
-      <w:proofErr w:type="spellEnd"/>
-      <w:r>
-        <w:rPr>
-          <w:rFonts w:ascii="Arial" w:hAnsi="Arial" w:cs="Arial"/>
-        </w:rPr>
-        <w:t>.</w:t>
+        <w:t>3) Configure Static IP address, modify MAC address, and verify network connectivity using ping and ifconfig.</w:t>
       </w:r>
     </w:p>
     <w:p>
@@ -2974,21 +2672,7 @@
         <w:rPr>
           <w:rFonts w:ascii="Arial" w:hAnsi="Arial" w:cs="Arial"/>
         </w:rPr>
-        <w:t xml:space="preserve">Verifying network connectivity using ping and </w:t>
-      </w:r>
-      <w:proofErr w:type="spellStart"/>
-      <w:r>
-        <w:rPr>
-          <w:rFonts w:ascii="Arial" w:hAnsi="Arial" w:cs="Arial"/>
-        </w:rPr>
-        <w:t>ifconfig</w:t>
-      </w:r>
-      <w:proofErr w:type="spellEnd"/>
-      <w:r>
-        <w:rPr>
-          <w:rFonts w:ascii="Arial" w:hAnsi="Arial" w:cs="Arial"/>
-        </w:rPr>
-        <w:t xml:space="preserve"> (ping pc0 from pc1)</w:t>
+        <w:t>Verifying network connectivity using ping and ifconfig (ping pc0 from pc1)</w:t>
       </w:r>
     </w:p>
     <w:p>
@@ -3051,21 +2735,7 @@
           <w:rFonts w:ascii="Arial" w:hAnsi="Arial" w:cs="Arial"/>
         </w:rPr>
         <w:lastRenderedPageBreak/>
-        <w:t xml:space="preserve">4. Troubleshoot Ethernet communication with ping and </w:t>
-      </w:r>
-      <w:proofErr w:type="spellStart"/>
-      <w:r>
-        <w:rPr>
-          <w:rFonts w:ascii="Arial" w:hAnsi="Arial" w:cs="Arial"/>
-        </w:rPr>
-        <w:t>tracert</w:t>
-      </w:r>
-      <w:proofErr w:type="spellEnd"/>
-      <w:r>
-        <w:rPr>
-          <w:rFonts w:ascii="Arial" w:hAnsi="Arial" w:cs="Arial"/>
-        </w:rPr>
-        <w:t>. Use Cisco packet Tracer</w:t>
+        <w:t>4. Troubleshoot Ethernet communication with ping and tracert. Use Cisco packet Tracer</w:t>
       </w:r>
     </w:p>
     <w:p>
@@ -3079,21 +2749,7 @@
         <w:rPr>
           <w:rFonts w:ascii="Arial" w:hAnsi="Arial" w:cs="Arial"/>
         </w:rPr>
-        <w:t xml:space="preserve">a)  Create a network topology with </w:t>
-      </w:r>
-      <w:proofErr w:type="spellStart"/>
-      <w:r>
-        <w:rPr>
-          <w:rFonts w:ascii="Arial" w:hAnsi="Arial" w:cs="Arial"/>
-        </w:rPr>
-        <w:t>atleast</w:t>
-      </w:r>
-      <w:proofErr w:type="spellEnd"/>
-      <w:r>
-        <w:rPr>
-          <w:rFonts w:ascii="Arial" w:hAnsi="Arial" w:cs="Arial"/>
-        </w:rPr>
-        <w:t xml:space="preserve"> 2 </w:t>
+        <w:t xml:space="preserve">a)  Create a network topology with atleast 2 </w:t>
       </w:r>
       <w:r>
         <w:rPr>
@@ -3442,21 +3098,7 @@
         <w:rPr>
           <w:rFonts w:ascii="Arial" w:hAnsi="Arial" w:cs="Arial"/>
         </w:rPr>
-        <w:t xml:space="preserve">Now ping the </w:t>
-      </w:r>
-      <w:proofErr w:type="gramStart"/>
-      <w:r>
-        <w:rPr>
-          <w:rFonts w:ascii="Arial" w:hAnsi="Arial" w:cs="Arial"/>
-        </w:rPr>
-        <w:t>device</w:t>
-      </w:r>
-      <w:proofErr w:type="gramEnd"/>
-      <w:r>
-        <w:rPr>
-          <w:rFonts w:ascii="Arial" w:hAnsi="Arial" w:cs="Arial"/>
-        </w:rPr>
-        <w:t xml:space="preserve"> the configure the routing table </w:t>
+        <w:t xml:space="preserve">Now ping the device the configure the routing table </w:t>
       </w:r>
     </w:p>
     <w:p>
@@ -3610,16 +3252,8 @@
         <w:rPr>
           <w:rFonts w:ascii="Arial" w:hAnsi="Arial" w:cs="Arial"/>
         </w:rPr>
-        <w:t xml:space="preserve">such as the in Gig (0/2) in router 7 and debug with </w:t>
-      </w:r>
-      <w:proofErr w:type="spellStart"/>
-      <w:r>
-        <w:rPr>
-          <w:rFonts w:ascii="Arial" w:hAnsi="Arial" w:cs="Arial"/>
-        </w:rPr>
-        <w:t>tracert</w:t>
-      </w:r>
-      <w:proofErr w:type="spellEnd"/>
+        <w:t>such as the in Gig (0/2) in router 7 and debug with tracert</w:t>
+      </w:r>
     </w:p>
     <w:p>
       <w:pPr>
@@ -3703,61 +3337,33 @@
         <w:rPr>
           <w:rFonts w:ascii="Arial" w:hAnsi="Arial" w:cs="Arial"/>
         </w:rPr>
-        <w:t xml:space="preserve">5. Create a simple LAN setup with two Linux machines connected via </w:t>
-      </w:r>
-      <w:proofErr w:type="gramStart"/>
-      <w:r>
-        <w:rPr>
-          <w:rFonts w:ascii="Arial" w:hAnsi="Arial" w:cs="Arial"/>
-        </w:rPr>
-        <w:t>switch.</w:t>
-      </w:r>
-      <w:r>
-        <w:rPr>
-          <w:rFonts w:ascii="Arial" w:hAnsi="Arial" w:cs="Arial"/>
-        </w:rPr>
-        <w:t>(</w:t>
-      </w:r>
-      <w:proofErr w:type="gramEnd"/>
-      <w:r>
-        <w:rPr>
-          <w:rFonts w:ascii="Arial" w:hAnsi="Arial" w:cs="Arial"/>
-        </w:rPr>
-        <w:t>done as last qn)</w:t>
-      </w:r>
-    </w:p>
-    <w:p>
-      <w:pPr>
-        <w:rPr>
-          <w:rFonts w:ascii="Arial" w:hAnsi="Arial" w:cs="Arial"/>
-        </w:rPr>
-      </w:pPr>
-    </w:p>
-    <w:p>
-      <w:pPr>
-        <w:rPr>
-          <w:rFonts w:ascii="Arial" w:hAnsi="Arial" w:cs="Arial"/>
-        </w:rPr>
-      </w:pPr>
-      <w:r>
-        <w:rPr>
-          <w:rFonts w:ascii="Arial" w:hAnsi="Arial" w:cs="Arial"/>
-        </w:rPr>
-        <w:t xml:space="preserve">6. Ping from one system to another if the ping fails use </w:t>
-      </w:r>
-      <w:proofErr w:type="spellStart"/>
-      <w:r>
-        <w:rPr>
-          <w:rFonts w:ascii="Arial" w:hAnsi="Arial" w:cs="Arial"/>
-        </w:rPr>
-        <w:t>ifconfig</w:t>
-      </w:r>
-      <w:proofErr w:type="spellEnd"/>
-      <w:r>
-        <w:rPr>
-          <w:rFonts w:ascii="Arial" w:hAnsi="Arial" w:cs="Arial"/>
-        </w:rPr>
-        <w:t xml:space="preserve"> to ensure that the IP addresses are configured correctly.</w:t>
+        <w:t>5. Create a simple LAN setup with two Linux machines connected via switch.</w:t>
+      </w:r>
+      <w:r>
+        <w:rPr>
+          <w:rFonts w:ascii="Arial" w:hAnsi="Arial" w:cs="Arial"/>
+        </w:rPr>
+        <w:t>(done as last qn)</w:t>
+      </w:r>
+    </w:p>
+    <w:p>
+      <w:pPr>
+        <w:rPr>
+          <w:rFonts w:ascii="Arial" w:hAnsi="Arial" w:cs="Arial"/>
+        </w:rPr>
+      </w:pPr>
+    </w:p>
+    <w:p>
+      <w:pPr>
+        <w:rPr>
+          <w:rFonts w:ascii="Arial" w:hAnsi="Arial" w:cs="Arial"/>
+        </w:rPr>
+      </w:pPr>
+      <w:r>
+        <w:rPr>
+          <w:rFonts w:ascii="Arial" w:hAnsi="Arial" w:cs="Arial"/>
+        </w:rPr>
+        <w:t>6. Ping from one system to another if the ping fails use ifconfig to ensure that the IP addresses are configured correctly.</w:t>
       </w:r>
     </w:p>
     <w:p>
@@ -3849,21 +3455,7 @@
         <w:rPr>
           <w:rFonts w:ascii="Arial" w:hAnsi="Arial" w:cs="Arial"/>
         </w:rPr>
-        <w:t xml:space="preserve">Using </w:t>
-      </w:r>
-      <w:proofErr w:type="spellStart"/>
-      <w:r>
-        <w:rPr>
-          <w:rFonts w:ascii="Arial" w:hAnsi="Arial" w:cs="Arial"/>
-        </w:rPr>
-        <w:t>ifconfig</w:t>
-      </w:r>
-      <w:proofErr w:type="spellEnd"/>
-      <w:r>
-        <w:rPr>
-          <w:rFonts w:ascii="Arial" w:hAnsi="Arial" w:cs="Arial"/>
-        </w:rPr>
-        <w:t xml:space="preserve"> to check if the system IP is configured correctly</w:t>
+        <w:t>Using ifconfig to check if the system IP is configured correctly</w:t>
       </w:r>
     </w:p>
     <w:p>
@@ -4024,21 +3616,7 @@
         <w:rPr>
           <w:rFonts w:ascii="Arial" w:hAnsi="Arial" w:cs="Arial"/>
         </w:rPr>
-        <w:t xml:space="preserve">7. Use traceroute to find where the packet </w:t>
-      </w:r>
-      <w:proofErr w:type="gramStart"/>
-      <w:r>
-        <w:rPr>
-          <w:rFonts w:ascii="Arial" w:hAnsi="Arial" w:cs="Arial"/>
-        </w:rPr>
-        <w:t>are</w:t>
-      </w:r>
-      <w:proofErr w:type="gramEnd"/>
-      <w:r>
-        <w:rPr>
-          <w:rFonts w:ascii="Arial" w:hAnsi="Arial" w:cs="Arial"/>
-        </w:rPr>
-        <w:t xml:space="preserve"> being dropped if the ping fails</w:t>
+        <w:t>7. Use traceroute to find where the packet are being dropped if the ping fails</w:t>
       </w:r>
     </w:p>
     <w:p>
@@ -4442,53 +4020,7 @@
           <w:kern w:val="0"/>
           <w14:ligatures w14:val="none"/>
         </w:rPr>
-        <w:t xml:space="preserve">Application Layer – User applications interact through system calls like </w:t>
-      </w:r>
-      <w:proofErr w:type="gramStart"/>
-      <w:r>
-        <w:rPr>
-          <w:rFonts w:ascii="Arial" w:eastAsia="Times New Roman" w:hAnsi="Arial" w:cs="Arial"/>
-          <w:kern w:val="0"/>
-          <w14:ligatures w14:val="none"/>
-        </w:rPr>
-        <w:t>send(</w:t>
-      </w:r>
-      <w:proofErr w:type="gramEnd"/>
-      <w:r>
-        <w:rPr>
-          <w:rFonts w:ascii="Arial" w:eastAsia="Times New Roman" w:hAnsi="Arial" w:cs="Arial"/>
-          <w:kern w:val="0"/>
-          <w14:ligatures w14:val="none"/>
-        </w:rPr>
-        <w:t xml:space="preserve">) and </w:t>
-      </w:r>
-      <w:proofErr w:type="spellStart"/>
-      <w:proofErr w:type="gramStart"/>
-      <w:r>
-        <w:rPr>
-          <w:rFonts w:ascii="Arial" w:eastAsia="Times New Roman" w:hAnsi="Arial" w:cs="Arial"/>
-          <w:kern w:val="0"/>
-          <w14:ligatures w14:val="none"/>
-        </w:rPr>
-        <w:t>recv</w:t>
-      </w:r>
-      <w:proofErr w:type="spellEnd"/>
-      <w:r>
-        <w:rPr>
-          <w:rFonts w:ascii="Arial" w:eastAsia="Times New Roman" w:hAnsi="Arial" w:cs="Arial"/>
-          <w:kern w:val="0"/>
-          <w14:ligatures w14:val="none"/>
-        </w:rPr>
-        <w:t>(</w:t>
-      </w:r>
-      <w:proofErr w:type="gramEnd"/>
-      <w:r>
-        <w:rPr>
-          <w:rFonts w:ascii="Arial" w:eastAsia="Times New Roman" w:hAnsi="Arial" w:cs="Arial"/>
-          <w:kern w:val="0"/>
-          <w14:ligatures w14:val="none"/>
-        </w:rPr>
-        <w:t>).</w:t>
+        <w:t>Application Layer – User applications interact through system calls like send() and recv().</w:t>
       </w:r>
     </w:p>
     <w:p>
@@ -4510,43 +4042,7 @@
           <w:kern w:val="0"/>
           <w14:ligatures w14:val="none"/>
         </w:rPr>
-        <w:t xml:space="preserve">Transport Layer – Implemented using structures such as struct </w:t>
-      </w:r>
-      <w:proofErr w:type="spellStart"/>
-      <w:r>
-        <w:rPr>
-          <w:rFonts w:ascii="Arial" w:eastAsia="Times New Roman" w:hAnsi="Arial" w:cs="Arial"/>
-          <w:kern w:val="0"/>
-          <w14:ligatures w14:val="none"/>
-        </w:rPr>
-        <w:t>tcp_sock</w:t>
-      </w:r>
-      <w:proofErr w:type="spellEnd"/>
-      <w:r>
-        <w:rPr>
-          <w:rFonts w:ascii="Arial" w:eastAsia="Times New Roman" w:hAnsi="Arial" w:cs="Arial"/>
-          <w:kern w:val="0"/>
-          <w14:ligatures w14:val="none"/>
-        </w:rPr>
-        <w:t xml:space="preserve"> for TCP and struct </w:t>
-      </w:r>
-      <w:proofErr w:type="spellStart"/>
-      <w:r>
-        <w:rPr>
-          <w:rFonts w:ascii="Arial" w:eastAsia="Times New Roman" w:hAnsi="Arial" w:cs="Arial"/>
-          <w:kern w:val="0"/>
-          <w14:ligatures w14:val="none"/>
-        </w:rPr>
-        <w:t>udp_sock</w:t>
-      </w:r>
-      <w:proofErr w:type="spellEnd"/>
-      <w:r>
-        <w:rPr>
-          <w:rFonts w:ascii="Arial" w:eastAsia="Times New Roman" w:hAnsi="Arial" w:cs="Arial"/>
-          <w:kern w:val="0"/>
-          <w14:ligatures w14:val="none"/>
-        </w:rPr>
-        <w:t xml:space="preserve"> for UDP.</w:t>
+        <w:t>Transport Layer – Implemented using structures such as struct tcp_sock for TCP and struct udp_sock for UDP.</w:t>
       </w:r>
     </w:p>
     <w:p>
@@ -4569,25 +4065,7 @@
           <w14:ligatures w14:val="none"/>
         </w:rPr>
         <w:lastRenderedPageBreak/>
-        <w:t xml:space="preserve">Network Layer – Uses struct </w:t>
-      </w:r>
-      <w:proofErr w:type="spellStart"/>
-      <w:r>
-        <w:rPr>
-          <w:rFonts w:ascii="Arial" w:eastAsia="Times New Roman" w:hAnsi="Arial" w:cs="Arial"/>
-          <w:kern w:val="0"/>
-          <w14:ligatures w14:val="none"/>
-        </w:rPr>
-        <w:t>iphdr</w:t>
-      </w:r>
-      <w:proofErr w:type="spellEnd"/>
-      <w:r>
-        <w:rPr>
-          <w:rFonts w:ascii="Arial" w:eastAsia="Times New Roman" w:hAnsi="Arial" w:cs="Arial"/>
-          <w:kern w:val="0"/>
-          <w14:ligatures w14:val="none"/>
-        </w:rPr>
-        <w:t xml:space="preserve"> to represent IP headers.</w:t>
+        <w:t>Network Layer – Uses struct iphdr to represent IP headers.</w:t>
       </w:r>
     </w:p>
     <w:p>
@@ -4609,25 +4087,7 @@
           <w:kern w:val="0"/>
           <w14:ligatures w14:val="none"/>
         </w:rPr>
-        <w:t xml:space="preserve">Data Link Layer (Ethernet) – Managed using Ethernet frame structures like struct </w:t>
-      </w:r>
-      <w:proofErr w:type="spellStart"/>
-      <w:r>
-        <w:rPr>
-          <w:rFonts w:ascii="Arial" w:eastAsia="Times New Roman" w:hAnsi="Arial" w:cs="Arial"/>
-          <w:kern w:val="0"/>
-          <w14:ligatures w14:val="none"/>
-        </w:rPr>
-        <w:t>ethhdr</w:t>
-      </w:r>
-      <w:proofErr w:type="spellEnd"/>
-      <w:r>
-        <w:rPr>
-          <w:rFonts w:ascii="Arial" w:eastAsia="Times New Roman" w:hAnsi="Arial" w:cs="Arial"/>
-          <w:kern w:val="0"/>
-          <w14:ligatures w14:val="none"/>
-        </w:rPr>
-        <w:t>.</w:t>
+        <w:t>Data Link Layer (Ethernet) – Managed using Ethernet frame structures like struct ethhdr.</w:t>
       </w:r>
     </w:p>
     <w:p>
@@ -4661,18 +4121,8 @@
           <w:kern w:val="0"/>
           <w14:ligatures w14:val="none"/>
         </w:rPr>
-        <w:t xml:space="preserve">struct </w:t>
-      </w:r>
-      <w:proofErr w:type="spellStart"/>
-      <w:r>
-        <w:rPr>
-          <w:rFonts w:ascii="Arial" w:eastAsia="Times New Roman" w:hAnsi="Arial" w:cs="Arial"/>
-          <w:kern w:val="0"/>
-          <w14:ligatures w14:val="none"/>
-        </w:rPr>
-        <w:t>sk_buff</w:t>
-      </w:r>
-      <w:proofErr w:type="spellEnd"/>
+        <w:t>struct sk_buff</w:t>
+      </w:r>
       <w:r>
         <w:rPr>
           <w:rFonts w:ascii="Arial" w:eastAsia="Times New Roman" w:hAnsi="Arial" w:cs="Arial"/>
@@ -4742,18 +4192,8 @@
           <w:kern w:val="0"/>
           <w14:ligatures w14:val="none"/>
         </w:rPr>
-        <w:t xml:space="preserve">struct </w:t>
-      </w:r>
-      <w:proofErr w:type="spellStart"/>
-      <w:r>
-        <w:rPr>
-          <w:rFonts w:ascii="Arial" w:eastAsia="Times New Roman" w:hAnsi="Arial" w:cs="Arial"/>
-          <w:kern w:val="0"/>
-          <w14:ligatures w14:val="none"/>
-        </w:rPr>
-        <w:t>net_device</w:t>
-      </w:r>
-      <w:proofErr w:type="spellEnd"/>
+        <w:t>struct net_device</w:t>
+      </w:r>
     </w:p>
     <w:p>
       <w:pPr>
@@ -4892,18 +4332,8 @@
           <w:kern w:val="0"/>
           <w14:ligatures w14:val="none"/>
         </w:rPr>
-        <w:t xml:space="preserve">struct </w:t>
-      </w:r>
-      <w:proofErr w:type="spellStart"/>
-      <w:r>
-        <w:rPr>
-          <w:rFonts w:ascii="Arial" w:eastAsia="Times New Roman" w:hAnsi="Arial" w:cs="Arial"/>
-          <w:kern w:val="0"/>
-          <w14:ligatures w14:val="none"/>
-        </w:rPr>
-        <w:t>net_device_ops</w:t>
-      </w:r>
-      <w:proofErr w:type="spellEnd"/>
+        <w:t>struct net_device_ops</w:t>
+      </w:r>
     </w:p>
     <w:p>
       <w:pPr>
@@ -4936,41 +4366,13 @@
           <w14:ligatures w14:val="none"/>
         </w:rPr>
       </w:pPr>
-      <w:proofErr w:type="spellStart"/>
-      <w:r>
-        <w:rPr>
-          <w:rFonts w:ascii="Arial" w:eastAsia="Times New Roman" w:hAnsi="Arial" w:cs="Arial"/>
-          <w:kern w:val="0"/>
-          <w14:ligatures w14:val="none"/>
-        </w:rPr>
-        <w:t>ndo_</w:t>
-      </w:r>
-      <w:proofErr w:type="gramStart"/>
-      <w:r>
-        <w:rPr>
-          <w:rFonts w:ascii="Arial" w:eastAsia="Times New Roman" w:hAnsi="Arial" w:cs="Arial"/>
-          <w:kern w:val="0"/>
-          <w14:ligatures w14:val="none"/>
-        </w:rPr>
-        <w:t>open</w:t>
-      </w:r>
-      <w:proofErr w:type="spellEnd"/>
-      <w:r>
-        <w:rPr>
-          <w:rFonts w:ascii="Arial" w:eastAsia="Times New Roman" w:hAnsi="Arial" w:cs="Arial"/>
-          <w:kern w:val="0"/>
-          <w14:ligatures w14:val="none"/>
-        </w:rPr>
-        <w:t>(</w:t>
-      </w:r>
-      <w:proofErr w:type="gramEnd"/>
-      <w:r>
-        <w:rPr>
-          <w:rFonts w:ascii="Arial" w:eastAsia="Times New Roman" w:hAnsi="Arial" w:cs="Arial"/>
-          <w:kern w:val="0"/>
-          <w14:ligatures w14:val="none"/>
-        </w:rPr>
-        <w:t>) – Starts the network device</w:t>
+      <w:r>
+        <w:rPr>
+          <w:rFonts w:ascii="Arial" w:eastAsia="Times New Roman" w:hAnsi="Arial" w:cs="Arial"/>
+          <w:kern w:val="0"/>
+          <w14:ligatures w14:val="none"/>
+        </w:rPr>
+        <w:t>ndo_open() – Starts the network device</w:t>
       </w:r>
     </w:p>
     <w:p>
@@ -4986,41 +4388,13 @@
           <w14:ligatures w14:val="none"/>
         </w:rPr>
       </w:pPr>
-      <w:proofErr w:type="spellStart"/>
-      <w:r>
-        <w:rPr>
-          <w:rFonts w:ascii="Arial" w:eastAsia="Times New Roman" w:hAnsi="Arial" w:cs="Arial"/>
-          <w:kern w:val="0"/>
-          <w14:ligatures w14:val="none"/>
-        </w:rPr>
-        <w:t>ndo_</w:t>
-      </w:r>
-      <w:proofErr w:type="gramStart"/>
-      <w:r>
-        <w:rPr>
-          <w:rFonts w:ascii="Arial" w:eastAsia="Times New Roman" w:hAnsi="Arial" w:cs="Arial"/>
-          <w:kern w:val="0"/>
-          <w14:ligatures w14:val="none"/>
-        </w:rPr>
-        <w:t>stop</w:t>
-      </w:r>
-      <w:proofErr w:type="spellEnd"/>
-      <w:r>
-        <w:rPr>
-          <w:rFonts w:ascii="Arial" w:eastAsia="Times New Roman" w:hAnsi="Arial" w:cs="Arial"/>
-          <w:kern w:val="0"/>
-          <w14:ligatures w14:val="none"/>
-        </w:rPr>
-        <w:t>(</w:t>
-      </w:r>
-      <w:proofErr w:type="gramEnd"/>
-      <w:r>
-        <w:rPr>
-          <w:rFonts w:ascii="Arial" w:eastAsia="Times New Roman" w:hAnsi="Arial" w:cs="Arial"/>
-          <w:kern w:val="0"/>
-          <w14:ligatures w14:val="none"/>
-        </w:rPr>
-        <w:t>) – Stops the device</w:t>
+      <w:r>
+        <w:rPr>
+          <w:rFonts w:ascii="Arial" w:eastAsia="Times New Roman" w:hAnsi="Arial" w:cs="Arial"/>
+          <w:kern w:val="0"/>
+          <w14:ligatures w14:val="none"/>
+        </w:rPr>
+        <w:t>ndo_stop() – Stops the device</w:t>
       </w:r>
     </w:p>
     <w:p>
@@ -5036,41 +4410,13 @@
           <w14:ligatures w14:val="none"/>
         </w:rPr>
       </w:pPr>
-      <w:proofErr w:type="spellStart"/>
-      <w:r>
-        <w:rPr>
-          <w:rFonts w:ascii="Arial" w:eastAsia="Times New Roman" w:hAnsi="Arial" w:cs="Arial"/>
-          <w:kern w:val="0"/>
-          <w14:ligatures w14:val="none"/>
-        </w:rPr>
-        <w:t>ndo_start_</w:t>
-      </w:r>
-      <w:proofErr w:type="gramStart"/>
-      <w:r>
-        <w:rPr>
-          <w:rFonts w:ascii="Arial" w:eastAsia="Times New Roman" w:hAnsi="Arial" w:cs="Arial"/>
-          <w:kern w:val="0"/>
-          <w14:ligatures w14:val="none"/>
-        </w:rPr>
-        <w:t>xmit</w:t>
-      </w:r>
-      <w:proofErr w:type="spellEnd"/>
-      <w:r>
-        <w:rPr>
-          <w:rFonts w:ascii="Arial" w:eastAsia="Times New Roman" w:hAnsi="Arial" w:cs="Arial"/>
-          <w:kern w:val="0"/>
-          <w14:ligatures w14:val="none"/>
-        </w:rPr>
-        <w:t>(</w:t>
-      </w:r>
-      <w:proofErr w:type="gramEnd"/>
-      <w:r>
-        <w:rPr>
-          <w:rFonts w:ascii="Arial" w:eastAsia="Times New Roman" w:hAnsi="Arial" w:cs="Arial"/>
-          <w:kern w:val="0"/>
-          <w14:ligatures w14:val="none"/>
-        </w:rPr>
-        <w:t>) – Handles packet transmission</w:t>
+      <w:r>
+        <w:rPr>
+          <w:rFonts w:ascii="Arial" w:eastAsia="Times New Roman" w:hAnsi="Arial" w:cs="Arial"/>
+          <w:kern w:val="0"/>
+          <w14:ligatures w14:val="none"/>
+        </w:rPr>
+        <w:t>ndo_start_xmit() – Handles packet transmission</w:t>
       </w:r>
     </w:p>
     <w:p>
@@ -5086,41 +4432,13 @@
           <w14:ligatures w14:val="none"/>
         </w:rPr>
       </w:pPr>
-      <w:proofErr w:type="spellStart"/>
-      <w:r>
-        <w:rPr>
-          <w:rFonts w:ascii="Arial" w:eastAsia="Times New Roman" w:hAnsi="Arial" w:cs="Arial"/>
-          <w:kern w:val="0"/>
-          <w14:ligatures w14:val="none"/>
-        </w:rPr>
-        <w:t>ndo_set_rx_</w:t>
-      </w:r>
-      <w:proofErr w:type="gramStart"/>
-      <w:r>
-        <w:rPr>
-          <w:rFonts w:ascii="Arial" w:eastAsia="Times New Roman" w:hAnsi="Arial" w:cs="Arial"/>
-          <w:kern w:val="0"/>
-          <w14:ligatures w14:val="none"/>
-        </w:rPr>
-        <w:t>mode</w:t>
-      </w:r>
-      <w:proofErr w:type="spellEnd"/>
-      <w:r>
-        <w:rPr>
-          <w:rFonts w:ascii="Arial" w:eastAsia="Times New Roman" w:hAnsi="Arial" w:cs="Arial"/>
-          <w:kern w:val="0"/>
-          <w14:ligatures w14:val="none"/>
-        </w:rPr>
-        <w:t>(</w:t>
-      </w:r>
-      <w:proofErr w:type="gramEnd"/>
-      <w:r>
-        <w:rPr>
-          <w:rFonts w:ascii="Arial" w:eastAsia="Times New Roman" w:hAnsi="Arial" w:cs="Arial"/>
-          <w:kern w:val="0"/>
-          <w14:ligatures w14:val="none"/>
-        </w:rPr>
-        <w:t>) – Configures receive mode</w:t>
+      <w:r>
+        <w:rPr>
+          <w:rFonts w:ascii="Arial" w:eastAsia="Times New Roman" w:hAnsi="Arial" w:cs="Arial"/>
+          <w:kern w:val="0"/>
+          <w14:ligatures w14:val="none"/>
+        </w:rPr>
+        <w:t>ndo_set_rx_mode() – Configures receive mode</w:t>
       </w:r>
     </w:p>
     <w:p>
@@ -5177,25 +4495,7 @@
           <w:kern w:val="0"/>
           <w14:ligatures w14:val="none"/>
         </w:rPr>
-        <w:t xml:space="preserve">When an application sends data, the kernel creates a packet stored in a struct </w:t>
-      </w:r>
-      <w:proofErr w:type="spellStart"/>
-      <w:r>
-        <w:rPr>
-          <w:rFonts w:ascii="Arial" w:eastAsia="Times New Roman" w:hAnsi="Arial" w:cs="Arial"/>
-          <w:kern w:val="0"/>
-          <w14:ligatures w14:val="none"/>
-        </w:rPr>
-        <w:t>sk_buff</w:t>
-      </w:r>
-      <w:proofErr w:type="spellEnd"/>
-      <w:r>
-        <w:rPr>
-          <w:rFonts w:ascii="Arial" w:eastAsia="Times New Roman" w:hAnsi="Arial" w:cs="Arial"/>
-          <w:kern w:val="0"/>
-          <w14:ligatures w14:val="none"/>
-        </w:rPr>
-        <w:t>. The packet moves through the networking stack and eventually reaches the Ethernet driver.</w:t>
+        <w:t>When an application sends data, the kernel creates a packet stored in a struct sk_buff. The packet moves through the networking stack and eventually reaches the Ethernet driver.</w:t>
       </w:r>
     </w:p>
     <w:p>
@@ -5225,95 +4525,13 @@
           <w14:ligatures w14:val="none"/>
         </w:rPr>
       </w:pPr>
-      <w:proofErr w:type="spellStart"/>
-      <w:r>
-        <w:rPr>
-          <w:rFonts w:ascii="Arial" w:eastAsia="Times New Roman" w:hAnsi="Arial" w:cs="Arial"/>
-          <w:kern w:val="0"/>
-          <w14:ligatures w14:val="none"/>
-        </w:rPr>
-        <w:t>ndo_start_</w:t>
-      </w:r>
-      <w:proofErr w:type="gramStart"/>
-      <w:r>
-        <w:rPr>
-          <w:rFonts w:ascii="Arial" w:eastAsia="Times New Roman" w:hAnsi="Arial" w:cs="Arial"/>
-          <w:kern w:val="0"/>
-          <w14:ligatures w14:val="none"/>
-        </w:rPr>
-        <w:t>xmit</w:t>
-      </w:r>
-      <w:proofErr w:type="spellEnd"/>
-      <w:r>
-        <w:rPr>
-          <w:rFonts w:ascii="Arial" w:eastAsia="Times New Roman" w:hAnsi="Arial" w:cs="Arial"/>
-          <w:kern w:val="0"/>
-          <w14:ligatures w14:val="none"/>
-        </w:rPr>
-        <w:t>(</w:t>
-      </w:r>
-      <w:proofErr w:type="gramEnd"/>
-      <w:r>
-        <w:rPr>
-          <w:rFonts w:ascii="Arial" w:eastAsia="Times New Roman" w:hAnsi="Arial" w:cs="Arial"/>
-          <w:kern w:val="0"/>
-          <w14:ligatures w14:val="none"/>
-        </w:rPr>
-        <w:t xml:space="preserve">struct </w:t>
-      </w:r>
-      <w:proofErr w:type="spellStart"/>
-      <w:r>
-        <w:rPr>
-          <w:rFonts w:ascii="Arial" w:eastAsia="Times New Roman" w:hAnsi="Arial" w:cs="Arial"/>
-          <w:kern w:val="0"/>
-          <w14:ligatures w14:val="none"/>
-        </w:rPr>
-        <w:t>sk_buff</w:t>
-      </w:r>
-      <w:proofErr w:type="spellEnd"/>
-      <w:r>
-        <w:rPr>
-          <w:rFonts w:ascii="Arial" w:eastAsia="Times New Roman" w:hAnsi="Arial" w:cs="Arial"/>
-          <w:kern w:val="0"/>
-          <w14:ligatures w14:val="none"/>
-        </w:rPr>
-        <w:t xml:space="preserve"> *</w:t>
-      </w:r>
-      <w:proofErr w:type="spellStart"/>
-      <w:r>
-        <w:rPr>
-          <w:rFonts w:ascii="Arial" w:eastAsia="Times New Roman" w:hAnsi="Arial" w:cs="Arial"/>
-          <w:kern w:val="0"/>
-          <w14:ligatures w14:val="none"/>
-        </w:rPr>
-        <w:t>skb</w:t>
-      </w:r>
-      <w:proofErr w:type="spellEnd"/>
-      <w:r>
-        <w:rPr>
-          <w:rFonts w:ascii="Arial" w:eastAsia="Times New Roman" w:hAnsi="Arial" w:cs="Arial"/>
-          <w:kern w:val="0"/>
-          <w14:ligatures w14:val="none"/>
-        </w:rPr>
-        <w:t xml:space="preserve">, struct </w:t>
-      </w:r>
-      <w:proofErr w:type="spellStart"/>
-      <w:r>
-        <w:rPr>
-          <w:rFonts w:ascii="Arial" w:eastAsia="Times New Roman" w:hAnsi="Arial" w:cs="Arial"/>
-          <w:kern w:val="0"/>
-          <w14:ligatures w14:val="none"/>
-        </w:rPr>
-        <w:t>net_device</w:t>
-      </w:r>
-      <w:proofErr w:type="spellEnd"/>
-      <w:r>
-        <w:rPr>
-          <w:rFonts w:ascii="Arial" w:eastAsia="Times New Roman" w:hAnsi="Arial" w:cs="Arial"/>
-          <w:kern w:val="0"/>
-          <w14:ligatures w14:val="none"/>
-        </w:rPr>
-        <w:t xml:space="preserve"> *dev)</w:t>
+      <w:r>
+        <w:rPr>
+          <w:rFonts w:ascii="Arial" w:eastAsia="Times New Roman" w:hAnsi="Arial" w:cs="Arial"/>
+          <w:kern w:val="0"/>
+          <w14:ligatures w14:val="none"/>
+        </w:rPr>
+        <w:t>ndo_start_xmit(struct sk_buff *skb, struct net_device *dev)</w:t>
       </w:r>
     </w:p>
     <w:p>
@@ -5365,18 +4583,8 @@
           <w:kern w:val="0"/>
           <w14:ligatures w14:val="none"/>
         </w:rPr>
-        <w:t xml:space="preserve">struct </w:t>
-      </w:r>
-      <w:proofErr w:type="spellStart"/>
-      <w:r>
-        <w:rPr>
-          <w:rFonts w:ascii="Arial" w:eastAsia="Times New Roman" w:hAnsi="Arial" w:cs="Arial"/>
-          <w:kern w:val="0"/>
-          <w14:ligatures w14:val="none"/>
-        </w:rPr>
-        <w:t>ethhdr</w:t>
-      </w:r>
-      <w:proofErr w:type="spellEnd"/>
+        <w:t>struct ethhdr</w:t>
+      </w:r>
     </w:p>
     <w:p>
       <w:pPr>
@@ -5453,23 +4661,13 @@
           <w14:ligatures w14:val="none"/>
         </w:rPr>
       </w:pPr>
-      <w:proofErr w:type="spellStart"/>
-      <w:r>
-        <w:rPr>
-          <w:rFonts w:ascii="Arial" w:eastAsia="Times New Roman" w:hAnsi="Arial" w:cs="Arial"/>
-          <w:kern w:val="0"/>
-          <w14:ligatures w14:val="none"/>
-        </w:rPr>
-        <w:t>EtherType</w:t>
-      </w:r>
-      <w:proofErr w:type="spellEnd"/>
-      <w:r>
-        <w:rPr>
-          <w:rFonts w:ascii="Arial" w:eastAsia="Times New Roman" w:hAnsi="Arial" w:cs="Arial"/>
-          <w:kern w:val="0"/>
-          <w14:ligatures w14:val="none"/>
-        </w:rPr>
-        <w:t xml:space="preserve"> field</w:t>
+      <w:r>
+        <w:rPr>
+          <w:rFonts w:ascii="Arial" w:eastAsia="Times New Roman" w:hAnsi="Arial" w:cs="Arial"/>
+          <w:kern w:val="0"/>
+          <w14:ligatures w14:val="none"/>
+        </w:rPr>
+        <w:t>EtherType field</w:t>
       </w:r>
     </w:p>
     <w:p>
@@ -5538,25 +4736,7 @@
           <w:kern w:val="0"/>
           <w14:ligatures w14:val="none"/>
         </w:rPr>
-        <w:t xml:space="preserve">The driver retrieves the received packet and stores it in a struct </w:t>
-      </w:r>
-      <w:proofErr w:type="spellStart"/>
-      <w:r>
-        <w:rPr>
-          <w:rFonts w:ascii="Arial" w:eastAsia="Times New Roman" w:hAnsi="Arial" w:cs="Arial"/>
-          <w:kern w:val="0"/>
-          <w14:ligatures w14:val="none"/>
-        </w:rPr>
-        <w:t>sk_buff</w:t>
-      </w:r>
-      <w:proofErr w:type="spellEnd"/>
-      <w:r>
-        <w:rPr>
-          <w:rFonts w:ascii="Arial" w:eastAsia="Times New Roman" w:hAnsi="Arial" w:cs="Arial"/>
-          <w:kern w:val="0"/>
-          <w14:ligatures w14:val="none"/>
-        </w:rPr>
-        <w:t>. The packet is then passed to the networking stack using functions like</w:t>
+        <w:t>The driver retrieves the received packet and stores it in a struct sk_buff. The packet is then passed to the networking stack using functions like</w:t>
       </w:r>
       <w:r>
         <w:rPr>
@@ -5566,41 +4746,13 @@
         </w:rPr>
         <w:t xml:space="preserve">, </w:t>
       </w:r>
-      <w:proofErr w:type="spellStart"/>
-      <w:r>
-        <w:rPr>
-          <w:rFonts w:ascii="Arial" w:eastAsia="Times New Roman" w:hAnsi="Arial" w:cs="Arial"/>
-          <w:kern w:val="0"/>
-          <w14:ligatures w14:val="none"/>
-        </w:rPr>
-        <w:t>netif_receive_</w:t>
-      </w:r>
-      <w:proofErr w:type="gramStart"/>
-      <w:r>
-        <w:rPr>
-          <w:rFonts w:ascii="Arial" w:eastAsia="Times New Roman" w:hAnsi="Arial" w:cs="Arial"/>
-          <w:kern w:val="0"/>
-          <w14:ligatures w14:val="none"/>
-        </w:rPr>
-        <w:t>skb</w:t>
-      </w:r>
-      <w:proofErr w:type="spellEnd"/>
-      <w:r>
-        <w:rPr>
-          <w:rFonts w:ascii="Arial" w:eastAsia="Times New Roman" w:hAnsi="Arial" w:cs="Arial"/>
-          <w:kern w:val="0"/>
-          <w14:ligatures w14:val="none"/>
-        </w:rPr>
-        <w:t>(</w:t>
-      </w:r>
-      <w:proofErr w:type="gramEnd"/>
-      <w:r>
-        <w:rPr>
-          <w:rFonts w:ascii="Arial" w:eastAsia="Times New Roman" w:hAnsi="Arial" w:cs="Arial"/>
-          <w:kern w:val="0"/>
-          <w14:ligatures w14:val="none"/>
-        </w:rPr>
-        <w:t>)</w:t>
+      <w:r>
+        <w:rPr>
+          <w:rFonts w:ascii="Arial" w:eastAsia="Times New Roman" w:hAnsi="Arial" w:cs="Arial"/>
+          <w:kern w:val="0"/>
+          <w14:ligatures w14:val="none"/>
+        </w:rPr>
+        <w:t>netif_receive_skb()</w:t>
       </w:r>
     </w:p>
     <w:p>
@@ -5634,25 +4786,7 @@
           <w:kern w:val="0"/>
           <w14:ligatures w14:val="none"/>
         </w:rPr>
-        <w:t xml:space="preserve"> the Ethernet header (struct </w:t>
-      </w:r>
-      <w:proofErr w:type="spellStart"/>
-      <w:r>
-        <w:rPr>
-          <w:rFonts w:ascii="Arial" w:eastAsia="Times New Roman" w:hAnsi="Arial" w:cs="Arial"/>
-          <w:kern w:val="0"/>
-          <w14:ligatures w14:val="none"/>
-        </w:rPr>
-        <w:t>ethhdr</w:t>
-      </w:r>
-      <w:proofErr w:type="spellEnd"/>
-      <w:r>
-        <w:rPr>
-          <w:rFonts w:ascii="Arial" w:eastAsia="Times New Roman" w:hAnsi="Arial" w:cs="Arial"/>
-          <w:kern w:val="0"/>
-          <w14:ligatures w14:val="none"/>
-        </w:rPr>
-        <w:t>) and forwards the packet to the appropriate protocol layer (IP, TCP, UDP) until it reaches the destination application.</w:t>
+        <w:t xml:space="preserve"> the Ethernet header (struct ethhdr) and forwards the packet to the appropriate protocol layer (IP, TCP, UDP) until it reaches the destination application.</w:t>
       </w:r>
     </w:p>
     <w:p>
@@ -5691,25 +4825,7 @@
           <w:kern w:val="0"/>
           <w14:ligatures w14:val="none"/>
         </w:rPr>
-        <w:t xml:space="preserve">In Linux, Ethernet interfaces appear as devices such as eth0, eth1, or modern names like enp3s0. These interfaces are managed by the kernel through the </w:t>
-      </w:r>
-      <w:proofErr w:type="spellStart"/>
-      <w:r>
-        <w:rPr>
-          <w:rFonts w:ascii="Arial" w:eastAsia="Times New Roman" w:hAnsi="Arial" w:cs="Arial"/>
-          <w:kern w:val="0"/>
-          <w14:ligatures w14:val="none"/>
-        </w:rPr>
-        <w:t>net_device</w:t>
-      </w:r>
-      <w:proofErr w:type="spellEnd"/>
-      <w:r>
-        <w:rPr>
-          <w:rFonts w:ascii="Arial" w:eastAsia="Times New Roman" w:hAnsi="Arial" w:cs="Arial"/>
-          <w:kern w:val="0"/>
-          <w14:ligatures w14:val="none"/>
-        </w:rPr>
-        <w:t xml:space="preserve"> subsystem.</w:t>
+        <w:t>In Linux, Ethernet interfaces appear as devices such as eth0, eth1, or modern names like enp3s0. These interfaces are managed by the kernel through the net_device subsystem.</w:t>
       </w:r>
     </w:p>
     <w:p>
@@ -5743,23 +4859,13 @@
           <w14:ligatures w14:val="none"/>
         </w:rPr>
       </w:pPr>
-      <w:proofErr w:type="spellStart"/>
-      <w:r>
-        <w:rPr>
-          <w:rFonts w:ascii="Arial" w:eastAsia="Times New Roman" w:hAnsi="Arial" w:cs="Arial"/>
-          <w:kern w:val="0"/>
-          <w14:ligatures w14:val="none"/>
-        </w:rPr>
-        <w:t>ip</w:t>
-      </w:r>
-      <w:proofErr w:type="spellEnd"/>
-      <w:r>
-        <w:rPr>
-          <w:rFonts w:ascii="Arial" w:eastAsia="Times New Roman" w:hAnsi="Arial" w:cs="Arial"/>
-          <w:kern w:val="0"/>
-          <w14:ligatures w14:val="none"/>
-        </w:rPr>
-        <w:t xml:space="preserve"> command</w:t>
+      <w:r>
+        <w:rPr>
+          <w:rFonts w:ascii="Arial" w:eastAsia="Times New Roman" w:hAnsi="Arial" w:cs="Arial"/>
+          <w:kern w:val="0"/>
+          <w14:ligatures w14:val="none"/>
+        </w:rPr>
+        <w:t>ip command</w:t>
       </w:r>
     </w:p>
     <w:p>
@@ -5775,7 +4881,6 @@
           <w14:ligatures w14:val="none"/>
         </w:rPr>
       </w:pPr>
-      <w:proofErr w:type="spellStart"/>
       <w:r>
         <w:rPr>
           <w:rFonts w:ascii="Arial" w:eastAsia="Times New Roman" w:hAnsi="Arial" w:cs="Arial"/>
@@ -5784,7 +4889,6 @@
         </w:rPr>
         <w:t>ifconfig</w:t>
       </w:r>
-      <w:proofErr w:type="spellEnd"/>
     </w:p>
     <w:p>
       <w:pPr>
@@ -5799,7 +4903,6 @@
           <w14:ligatures w14:val="none"/>
         </w:rPr>
       </w:pPr>
-      <w:proofErr w:type="spellStart"/>
       <w:r>
         <w:rPr>
           <w:rFonts w:ascii="Arial" w:eastAsia="Times New Roman" w:hAnsi="Arial" w:cs="Arial"/>
@@ -5808,7 +4911,6 @@
         </w:rPr>
         <w:t>ethtool</w:t>
       </w:r>
-      <w:proofErr w:type="spellEnd"/>
     </w:p>
     <w:p>
       <w:pPr>
@@ -5825,25 +4927,7 @@
           <w:kern w:val="0"/>
           <w14:ligatures w14:val="none"/>
         </w:rPr>
-        <w:t xml:space="preserve">These tools communicate with the kernel using </w:t>
-      </w:r>
-      <w:proofErr w:type="spellStart"/>
-      <w:r>
-        <w:rPr>
-          <w:rFonts w:ascii="Arial" w:eastAsia="Times New Roman" w:hAnsi="Arial" w:cs="Arial"/>
-          <w:kern w:val="0"/>
-          <w14:ligatures w14:val="none"/>
-        </w:rPr>
-        <w:t>netlink</w:t>
-      </w:r>
-      <w:proofErr w:type="spellEnd"/>
-      <w:r>
-        <w:rPr>
-          <w:rFonts w:ascii="Arial" w:eastAsia="Times New Roman" w:hAnsi="Arial" w:cs="Arial"/>
-          <w:kern w:val="0"/>
-          <w14:ligatures w14:val="none"/>
-        </w:rPr>
-        <w:t xml:space="preserve"> sockets (NETLINK_ROUTE) to configure network interfaces.</w:t>
+        <w:t>These tools communicate with the kernel using netlink sockets (NETLINK_ROUTE) to configure network interfaces.</w:t>
       </w:r>
     </w:p>
     <w:p>
@@ -5871,25 +4955,7 @@
           <w:kern w:val="0"/>
           <w14:ligatures w14:val="none"/>
         </w:rPr>
-        <w:t xml:space="preserve">9. Describe how would you configure a basic LAN interface using the </w:t>
-      </w:r>
-      <w:proofErr w:type="spellStart"/>
-      <w:r>
-        <w:rPr>
-          <w:rFonts w:ascii="Arial" w:eastAsia="Times New Roman" w:hAnsi="Arial" w:cs="Arial"/>
-          <w:kern w:val="0"/>
-          <w14:ligatures w14:val="none"/>
-        </w:rPr>
-        <w:t>ip</w:t>
-      </w:r>
-      <w:proofErr w:type="spellEnd"/>
-      <w:r>
-        <w:rPr>
-          <w:rFonts w:ascii="Arial" w:eastAsia="Times New Roman" w:hAnsi="Arial" w:cs="Arial"/>
-          <w:kern w:val="0"/>
-          <w14:ligatures w14:val="none"/>
-        </w:rPr>
-        <w:t xml:space="preserve"> command in Linux Kernel.</w:t>
+        <w:t>9. Describe how would you configure a basic LAN interface using the ip command in Linux Kernel.</w:t>
       </w:r>
     </w:p>
     <w:p>
@@ -5952,7 +5018,6 @@
           <w14:ligatures w14:val="none"/>
         </w:rPr>
       </w:pPr>
-      <w:proofErr w:type="spellStart"/>
       <w:r>
         <w:rPr>
           <w:rFonts w:ascii="Arial" w:eastAsia="Times New Roman" w:hAnsi="Arial" w:cs="Arial"/>
@@ -5961,9 +5026,8 @@
           <w:kern w:val="0"/>
           <w14:ligatures w14:val="none"/>
         </w:rPr>
-        <w:t>sudo</w:t>
-      </w:r>
-      <w:proofErr w:type="spellEnd"/>
+        <w:t xml:space="preserve">sudo </w:t>
+      </w:r>
       <w:r>
         <w:rPr>
           <w:rFonts w:ascii="Arial" w:eastAsia="Times New Roman" w:hAnsi="Arial" w:cs="Arial"/>
@@ -5972,29 +5036,7 @@
           <w:kern w:val="0"/>
           <w14:ligatures w14:val="none"/>
         </w:rPr>
-        <w:t xml:space="preserve"> </w:t>
-      </w:r>
-      <w:proofErr w:type="spellStart"/>
-      <w:r>
-        <w:rPr>
-          <w:rFonts w:ascii="Arial" w:eastAsia="Times New Roman" w:hAnsi="Arial" w:cs="Arial"/>
-          <w:b/>
-          <w:bCs/>
-          <w:kern w:val="0"/>
-          <w14:ligatures w14:val="none"/>
-        </w:rPr>
-        <w:t>ip</w:t>
-      </w:r>
-      <w:proofErr w:type="spellEnd"/>
-      <w:r>
-        <w:rPr>
-          <w:rFonts w:ascii="Arial" w:eastAsia="Times New Roman" w:hAnsi="Arial" w:cs="Arial"/>
-          <w:b/>
-          <w:bCs/>
-          <w:kern w:val="0"/>
-          <w14:ligatures w14:val="none"/>
-        </w:rPr>
-        <w:t xml:space="preserve"> link show</w:t>
+        <w:t>ip link show</w:t>
       </w:r>
     </w:p>
     <w:p>
@@ -6030,7 +5072,6 @@
           <w14:ligatures w14:val="none"/>
         </w:rPr>
       </w:pPr>
-      <w:proofErr w:type="spellStart"/>
       <w:r>
         <w:rPr>
           <w:rFonts w:ascii="Arial" w:eastAsia="Times New Roman" w:hAnsi="Arial" w:cs="Arial"/>
@@ -6039,40 +5080,7 @@
           <w:kern w:val="0"/>
           <w14:ligatures w14:val="none"/>
         </w:rPr>
-        <w:t>sudo</w:t>
-      </w:r>
-      <w:proofErr w:type="spellEnd"/>
-      <w:r>
-        <w:rPr>
-          <w:rFonts w:ascii="Arial" w:eastAsia="Times New Roman" w:hAnsi="Arial" w:cs="Arial"/>
-          <w:b/>
-          <w:bCs/>
-          <w:kern w:val="0"/>
-          <w14:ligatures w14:val="none"/>
-        </w:rPr>
-        <w:t xml:space="preserve"> </w:t>
-      </w:r>
-      <w:proofErr w:type="spellStart"/>
-      <w:r>
-        <w:rPr>
-          <w:rFonts w:ascii="Arial" w:eastAsia="Times New Roman" w:hAnsi="Arial" w:cs="Arial"/>
-          <w:b/>
-          <w:bCs/>
-          <w:kern w:val="0"/>
-          <w14:ligatures w14:val="none"/>
-        </w:rPr>
-        <w:t>ip</w:t>
-      </w:r>
-      <w:proofErr w:type="spellEnd"/>
-      <w:r>
-        <w:rPr>
-          <w:rFonts w:ascii="Arial" w:eastAsia="Times New Roman" w:hAnsi="Arial" w:cs="Arial"/>
-          <w:b/>
-          <w:bCs/>
-          <w:kern w:val="0"/>
-          <w14:ligatures w14:val="none"/>
-        </w:rPr>
-        <w:t xml:space="preserve"> link set dev eth0 down</w:t>
+        <w:t>sudo ip link set dev eth0 down</w:t>
       </w:r>
     </w:p>
     <w:p>
@@ -6110,7 +5118,6 @@
           <w14:ligatures w14:val="none"/>
         </w:rPr>
       </w:pPr>
-      <w:proofErr w:type="spellStart"/>
       <w:r>
         <w:rPr>
           <w:rFonts w:ascii="Arial" w:eastAsia="Times New Roman" w:hAnsi="Arial" w:cs="Arial"/>
@@ -6119,62 +5126,7 @@
           <w:kern w:val="0"/>
           <w14:ligatures w14:val="none"/>
         </w:rPr>
-        <w:t>sudo</w:t>
-      </w:r>
-      <w:proofErr w:type="spellEnd"/>
-      <w:r>
-        <w:rPr>
-          <w:rFonts w:ascii="Arial" w:eastAsia="Times New Roman" w:hAnsi="Arial" w:cs="Arial"/>
-          <w:b/>
-          <w:bCs/>
-          <w:kern w:val="0"/>
-          <w14:ligatures w14:val="none"/>
-        </w:rPr>
-        <w:t xml:space="preserve"> </w:t>
-      </w:r>
-      <w:proofErr w:type="spellStart"/>
-      <w:r>
-        <w:rPr>
-          <w:rFonts w:ascii="Arial" w:eastAsia="Times New Roman" w:hAnsi="Arial" w:cs="Arial"/>
-          <w:b/>
-          <w:bCs/>
-          <w:kern w:val="0"/>
-          <w14:ligatures w14:val="none"/>
-        </w:rPr>
-        <w:t>ip</w:t>
-      </w:r>
-      <w:proofErr w:type="spellEnd"/>
-      <w:r>
-        <w:rPr>
-          <w:rFonts w:ascii="Arial" w:eastAsia="Times New Roman" w:hAnsi="Arial" w:cs="Arial"/>
-          <w:b/>
-          <w:bCs/>
-          <w:kern w:val="0"/>
-          <w14:ligatures w14:val="none"/>
-        </w:rPr>
-        <w:t xml:space="preserve"> </w:t>
-      </w:r>
-      <w:proofErr w:type="spellStart"/>
-      <w:r>
-        <w:rPr>
-          <w:rFonts w:ascii="Arial" w:eastAsia="Times New Roman" w:hAnsi="Arial" w:cs="Arial"/>
-          <w:b/>
-          <w:bCs/>
-          <w:kern w:val="0"/>
-          <w14:ligatures w14:val="none"/>
-        </w:rPr>
-        <w:t>addr</w:t>
-      </w:r>
-      <w:proofErr w:type="spellEnd"/>
-      <w:r>
-        <w:rPr>
-          <w:rFonts w:ascii="Arial" w:eastAsia="Times New Roman" w:hAnsi="Arial" w:cs="Arial"/>
-          <w:b/>
-          <w:bCs/>
-          <w:kern w:val="0"/>
-          <w14:ligatures w14:val="none"/>
-        </w:rPr>
-        <w:t xml:space="preserve"> add 192.168.1.100/24 dev eth0</w:t>
+        <w:t>sudo ip addr add 192.168.1.100/24 dev eth0</w:t>
       </w:r>
       <w:r>
         <w:rPr>
@@ -6241,7 +5193,6 @@
           <w14:ligatures w14:val="none"/>
         </w:rPr>
       </w:pPr>
-      <w:proofErr w:type="spellStart"/>
       <w:r>
         <w:rPr>
           <w:rFonts w:ascii="Arial" w:eastAsia="Times New Roman" w:hAnsi="Arial" w:cs="Arial"/>
@@ -6250,40 +5201,7 @@
           <w:kern w:val="0"/>
           <w14:ligatures w14:val="none"/>
         </w:rPr>
-        <w:t>sudo</w:t>
-      </w:r>
-      <w:proofErr w:type="spellEnd"/>
-      <w:r>
-        <w:rPr>
-          <w:rFonts w:ascii="Arial" w:eastAsia="Times New Roman" w:hAnsi="Arial" w:cs="Arial"/>
-          <w:b/>
-          <w:bCs/>
-          <w:kern w:val="0"/>
-          <w14:ligatures w14:val="none"/>
-        </w:rPr>
-        <w:t xml:space="preserve"> </w:t>
-      </w:r>
-      <w:proofErr w:type="spellStart"/>
-      <w:r>
-        <w:rPr>
-          <w:rFonts w:ascii="Arial" w:eastAsia="Times New Roman" w:hAnsi="Arial" w:cs="Arial"/>
-          <w:b/>
-          <w:bCs/>
-          <w:kern w:val="0"/>
-          <w14:ligatures w14:val="none"/>
-        </w:rPr>
-        <w:t>ip</w:t>
-      </w:r>
-      <w:proofErr w:type="spellEnd"/>
-      <w:r>
-        <w:rPr>
-          <w:rFonts w:ascii="Arial" w:eastAsia="Times New Roman" w:hAnsi="Arial" w:cs="Arial"/>
-          <w:b/>
-          <w:bCs/>
-          <w:kern w:val="0"/>
-          <w14:ligatures w14:val="none"/>
-        </w:rPr>
-        <w:t xml:space="preserve"> link set dev eth0 up</w:t>
+        <w:t>sudo ip link set dev eth0 up</w:t>
       </w:r>
     </w:p>
     <w:p>
@@ -6331,7 +5249,6 @@
           <w14:ligatures w14:val="none"/>
         </w:rPr>
       </w:pPr>
-      <w:proofErr w:type="spellStart"/>
       <w:r>
         <w:rPr>
           <w:rFonts w:ascii="Arial" w:eastAsia="Times New Roman" w:hAnsi="Arial" w:cs="Arial"/>
@@ -6340,40 +5257,7 @@
           <w:kern w:val="0"/>
           <w14:ligatures w14:val="none"/>
         </w:rPr>
-        <w:t>sudo</w:t>
-      </w:r>
-      <w:proofErr w:type="spellEnd"/>
-      <w:r>
-        <w:rPr>
-          <w:rFonts w:ascii="Arial" w:eastAsia="Times New Roman" w:hAnsi="Arial" w:cs="Arial"/>
-          <w:b/>
-          <w:bCs/>
-          <w:kern w:val="0"/>
-          <w14:ligatures w14:val="none"/>
-        </w:rPr>
-        <w:t xml:space="preserve"> </w:t>
-      </w:r>
-      <w:proofErr w:type="spellStart"/>
-      <w:r>
-        <w:rPr>
-          <w:rFonts w:ascii="Arial" w:eastAsia="Times New Roman" w:hAnsi="Arial" w:cs="Arial"/>
-          <w:b/>
-          <w:bCs/>
-          <w:kern w:val="0"/>
-          <w14:ligatures w14:val="none"/>
-        </w:rPr>
-        <w:t>ip</w:t>
-      </w:r>
-      <w:proofErr w:type="spellEnd"/>
-      <w:r>
-        <w:rPr>
-          <w:rFonts w:ascii="Arial" w:eastAsia="Times New Roman" w:hAnsi="Arial" w:cs="Arial"/>
-          <w:b/>
-          <w:bCs/>
-          <w:kern w:val="0"/>
-          <w14:ligatures w14:val="none"/>
-        </w:rPr>
-        <w:t xml:space="preserve"> route add default via 192.168.1.1 dev eth0</w:t>
+        <w:t>sudo ip route add default via 192.168.1.1 dev eth0</w:t>
       </w:r>
     </w:p>
     <w:p>
@@ -6398,7 +5282,6 @@
         </w:rPr>
         <w:t xml:space="preserve">Remove an IP address: </w:t>
       </w:r>
-      <w:proofErr w:type="spellStart"/>
       <w:r>
         <w:rPr>
           <w:rFonts w:ascii="Arial" w:eastAsia="Times New Roman" w:hAnsi="Arial" w:cs="Arial"/>
@@ -6407,62 +5290,7 @@
           <w:kern w:val="0"/>
           <w14:ligatures w14:val="none"/>
         </w:rPr>
-        <w:t>sudo</w:t>
-      </w:r>
-      <w:proofErr w:type="spellEnd"/>
-      <w:r>
-        <w:rPr>
-          <w:rFonts w:ascii="Arial" w:eastAsia="Times New Roman" w:hAnsi="Arial" w:cs="Arial"/>
-          <w:b/>
-          <w:bCs/>
-          <w:kern w:val="0"/>
-          <w14:ligatures w14:val="none"/>
-        </w:rPr>
-        <w:t xml:space="preserve"> </w:t>
-      </w:r>
-      <w:proofErr w:type="spellStart"/>
-      <w:r>
-        <w:rPr>
-          <w:rFonts w:ascii="Arial" w:eastAsia="Times New Roman" w:hAnsi="Arial" w:cs="Arial"/>
-          <w:b/>
-          <w:bCs/>
-          <w:kern w:val="0"/>
-          <w14:ligatures w14:val="none"/>
-        </w:rPr>
-        <w:t>ip</w:t>
-      </w:r>
-      <w:proofErr w:type="spellEnd"/>
-      <w:r>
-        <w:rPr>
-          <w:rFonts w:ascii="Arial" w:eastAsia="Times New Roman" w:hAnsi="Arial" w:cs="Arial"/>
-          <w:b/>
-          <w:bCs/>
-          <w:kern w:val="0"/>
-          <w14:ligatures w14:val="none"/>
-        </w:rPr>
-        <w:t xml:space="preserve"> </w:t>
-      </w:r>
-      <w:proofErr w:type="spellStart"/>
-      <w:r>
-        <w:rPr>
-          <w:rFonts w:ascii="Arial" w:eastAsia="Times New Roman" w:hAnsi="Arial" w:cs="Arial"/>
-          <w:b/>
-          <w:bCs/>
-          <w:kern w:val="0"/>
-          <w14:ligatures w14:val="none"/>
-        </w:rPr>
-        <w:t>addr</w:t>
-      </w:r>
-      <w:proofErr w:type="spellEnd"/>
-      <w:r>
-        <w:rPr>
-          <w:rFonts w:ascii="Arial" w:eastAsia="Times New Roman" w:hAnsi="Arial" w:cs="Arial"/>
-          <w:b/>
-          <w:bCs/>
-          <w:kern w:val="0"/>
-          <w14:ligatures w14:val="none"/>
-        </w:rPr>
-        <w:t xml:space="preserve"> del 192.168.1.1</w:t>
+        <w:t>sudo ip addr del 192.168.1.1</w:t>
       </w:r>
       <w:r>
         <w:rPr>
@@ -6515,7 +5343,6 @@
         </w:rPr>
         <w:t xml:space="preserve">IP addresses: </w:t>
       </w:r>
-      <w:proofErr w:type="spellStart"/>
       <w:r>
         <w:rPr>
           <w:rFonts w:ascii="Arial" w:eastAsia="Times New Roman" w:hAnsi="Arial" w:cs="Arial"/>
@@ -6524,62 +5351,7 @@
           <w:kern w:val="0"/>
           <w14:ligatures w14:val="none"/>
         </w:rPr>
-        <w:t>sudo</w:t>
-      </w:r>
-      <w:proofErr w:type="spellEnd"/>
-      <w:r>
-        <w:rPr>
-          <w:rFonts w:ascii="Arial" w:eastAsia="Times New Roman" w:hAnsi="Arial" w:cs="Arial"/>
-          <w:b/>
-          <w:bCs/>
-          <w:kern w:val="0"/>
-          <w14:ligatures w14:val="none"/>
-        </w:rPr>
-        <w:t xml:space="preserve"> </w:t>
-      </w:r>
-      <w:proofErr w:type="spellStart"/>
-      <w:r>
-        <w:rPr>
-          <w:rFonts w:ascii="Arial" w:eastAsia="Times New Roman" w:hAnsi="Arial" w:cs="Arial"/>
-          <w:b/>
-          <w:bCs/>
-          <w:kern w:val="0"/>
-          <w14:ligatures w14:val="none"/>
-        </w:rPr>
-        <w:t>ip</w:t>
-      </w:r>
-      <w:proofErr w:type="spellEnd"/>
-      <w:r>
-        <w:rPr>
-          <w:rFonts w:ascii="Arial" w:eastAsia="Times New Roman" w:hAnsi="Arial" w:cs="Arial"/>
-          <w:b/>
-          <w:bCs/>
-          <w:kern w:val="0"/>
-          <w14:ligatures w14:val="none"/>
-        </w:rPr>
-        <w:t xml:space="preserve"> </w:t>
-      </w:r>
-      <w:proofErr w:type="spellStart"/>
-      <w:r>
-        <w:rPr>
-          <w:rFonts w:ascii="Arial" w:eastAsia="Times New Roman" w:hAnsi="Arial" w:cs="Arial"/>
-          <w:b/>
-          <w:bCs/>
-          <w:kern w:val="0"/>
-          <w14:ligatures w14:val="none"/>
-        </w:rPr>
-        <w:t>addr</w:t>
-      </w:r>
-      <w:proofErr w:type="spellEnd"/>
-      <w:r>
-        <w:rPr>
-          <w:rFonts w:ascii="Arial" w:eastAsia="Times New Roman" w:hAnsi="Arial" w:cs="Arial"/>
-          <w:b/>
-          <w:bCs/>
-          <w:kern w:val="0"/>
-          <w14:ligatures w14:val="none"/>
-        </w:rPr>
-        <w:t xml:space="preserve"> flush eth0</w:t>
+        <w:t>sudo ip addr flush eth0</w:t>
       </w:r>
     </w:p>
     <w:p>
@@ -6612,7 +5384,6 @@
         </w:rPr>
         <w:t xml:space="preserve">uting table: </w:t>
       </w:r>
-      <w:proofErr w:type="spellStart"/>
       <w:r>
         <w:rPr>
           <w:rFonts w:ascii="Arial" w:eastAsia="Times New Roman" w:hAnsi="Arial" w:cs="Arial"/>
@@ -6621,40 +5392,7 @@
           <w:kern w:val="0"/>
           <w14:ligatures w14:val="none"/>
         </w:rPr>
-        <w:t>sudo</w:t>
-      </w:r>
-      <w:proofErr w:type="spellEnd"/>
-      <w:r>
-        <w:rPr>
-          <w:rFonts w:ascii="Arial" w:eastAsia="Times New Roman" w:hAnsi="Arial" w:cs="Arial"/>
-          <w:b/>
-          <w:bCs/>
-          <w:kern w:val="0"/>
-          <w14:ligatures w14:val="none"/>
-        </w:rPr>
-        <w:t xml:space="preserve"> </w:t>
-      </w:r>
-      <w:proofErr w:type="spellStart"/>
-      <w:r>
-        <w:rPr>
-          <w:rFonts w:ascii="Arial" w:eastAsia="Times New Roman" w:hAnsi="Arial" w:cs="Arial"/>
-          <w:b/>
-          <w:bCs/>
-          <w:kern w:val="0"/>
-          <w14:ligatures w14:val="none"/>
-        </w:rPr>
-        <w:t>ip</w:t>
-      </w:r>
-      <w:proofErr w:type="spellEnd"/>
-      <w:r>
-        <w:rPr>
-          <w:rFonts w:ascii="Arial" w:eastAsia="Times New Roman" w:hAnsi="Arial" w:cs="Arial"/>
-          <w:b/>
-          <w:bCs/>
-          <w:kern w:val="0"/>
-          <w14:ligatures w14:val="none"/>
-        </w:rPr>
-        <w:t xml:space="preserve"> route show</w:t>
+        <w:t>sudo ip route show</w:t>
       </w:r>
     </w:p>
     <w:p>
@@ -6679,7 +5417,6 @@
         </w:rPr>
         <w:t xml:space="preserve">Verify the configuration: </w:t>
       </w:r>
-      <w:proofErr w:type="spellStart"/>
       <w:r>
         <w:rPr>
           <w:rFonts w:ascii="Arial" w:eastAsia="Times New Roman" w:hAnsi="Arial" w:cs="Arial"/>
@@ -6688,62 +5425,7 @@
           <w:kern w:val="0"/>
           <w14:ligatures w14:val="none"/>
         </w:rPr>
-        <w:t>sudo</w:t>
-      </w:r>
-      <w:proofErr w:type="spellEnd"/>
-      <w:r>
-        <w:rPr>
-          <w:rFonts w:ascii="Arial" w:eastAsia="Times New Roman" w:hAnsi="Arial" w:cs="Arial"/>
-          <w:b/>
-          <w:bCs/>
-          <w:kern w:val="0"/>
-          <w14:ligatures w14:val="none"/>
-        </w:rPr>
-        <w:t xml:space="preserve"> </w:t>
-      </w:r>
-      <w:proofErr w:type="spellStart"/>
-      <w:r>
-        <w:rPr>
-          <w:rFonts w:ascii="Arial" w:eastAsia="Times New Roman" w:hAnsi="Arial" w:cs="Arial"/>
-          <w:b/>
-          <w:bCs/>
-          <w:kern w:val="0"/>
-          <w14:ligatures w14:val="none"/>
-        </w:rPr>
-        <w:t>ip</w:t>
-      </w:r>
-      <w:proofErr w:type="spellEnd"/>
-      <w:r>
-        <w:rPr>
-          <w:rFonts w:ascii="Arial" w:eastAsia="Times New Roman" w:hAnsi="Arial" w:cs="Arial"/>
-          <w:b/>
-          <w:bCs/>
-          <w:kern w:val="0"/>
-          <w14:ligatures w14:val="none"/>
-        </w:rPr>
-        <w:t xml:space="preserve"> </w:t>
-      </w:r>
-      <w:proofErr w:type="spellStart"/>
-      <w:r>
-        <w:rPr>
-          <w:rFonts w:ascii="Arial" w:eastAsia="Times New Roman" w:hAnsi="Arial" w:cs="Arial"/>
-          <w:b/>
-          <w:bCs/>
-          <w:kern w:val="0"/>
-          <w14:ligatures w14:val="none"/>
-        </w:rPr>
-        <w:t>addr</w:t>
-      </w:r>
-      <w:proofErr w:type="spellEnd"/>
-      <w:r>
-        <w:rPr>
-          <w:rFonts w:ascii="Arial" w:eastAsia="Times New Roman" w:hAnsi="Arial" w:cs="Arial"/>
-          <w:b/>
-          <w:bCs/>
-          <w:kern w:val="0"/>
-          <w14:ligatures w14:val="none"/>
-        </w:rPr>
-        <w:t xml:space="preserve"> show eth0</w:t>
+        <w:t>sudo ip addr show eth0</w:t>
       </w:r>
     </w:p>
     <w:p>
@@ -6761,25 +5443,7 @@
           <w:kern w:val="0"/>
           <w14:ligatures w14:val="none"/>
         </w:rPr>
-        <w:t xml:space="preserve">10. Use Linux to view the MAC address table of the switch (if using a Linux based network switch). Use the bridge or </w:t>
-      </w:r>
-      <w:proofErr w:type="spellStart"/>
-      <w:r>
-        <w:rPr>
-          <w:rFonts w:ascii="Arial" w:eastAsia="Times New Roman" w:hAnsi="Arial" w:cs="Arial"/>
-          <w:kern w:val="0"/>
-          <w14:ligatures w14:val="none"/>
-        </w:rPr>
-        <w:t>ip</w:t>
-      </w:r>
-      <w:proofErr w:type="spellEnd"/>
-      <w:r>
-        <w:rPr>
-          <w:rFonts w:ascii="Arial" w:eastAsia="Times New Roman" w:hAnsi="Arial" w:cs="Arial"/>
-          <w:kern w:val="0"/>
-          <w14:ligatures w14:val="none"/>
-        </w:rPr>
-        <w:t xml:space="preserve"> link command to inspect the MAC table and demonstrate a basic switch operation</w:t>
+        <w:t>10. Use Linux to view the MAC address table of the switch (if using a Linux based network switch). Use the bridge or ip link command to inspect the MAC table and demonstrate a basic switch operation</w:t>
       </w:r>
     </w:p>
     <w:p>
@@ -6826,6 +5490,7 @@
       <w:r>
         <w:rPr>
           <w:rFonts w:ascii="Arial" w:eastAsia="Times New Roman" w:hAnsi="Arial" w:cs="Arial"/>
+          <w:noProof/>
           <w:kern w:val="0"/>
           <w14:ligatures w14:val="none"/>
         </w:rPr>
@@ -6881,25 +5546,7 @@
           <w:kern w:val="0"/>
           <w14:ligatures w14:val="none"/>
         </w:rPr>
-        <w:t xml:space="preserve">b) Using bridge or </w:t>
-      </w:r>
-      <w:proofErr w:type="spellStart"/>
-      <w:r>
-        <w:rPr>
-          <w:rFonts w:ascii="Arial" w:eastAsia="Times New Roman" w:hAnsi="Arial" w:cs="Arial"/>
-          <w:kern w:val="0"/>
-          <w14:ligatures w14:val="none"/>
-        </w:rPr>
-        <w:t>ip</w:t>
-      </w:r>
-      <w:proofErr w:type="spellEnd"/>
-      <w:r>
-        <w:rPr>
-          <w:rFonts w:ascii="Arial" w:eastAsia="Times New Roman" w:hAnsi="Arial" w:cs="Arial"/>
-          <w:kern w:val="0"/>
-          <w14:ligatures w14:val="none"/>
-        </w:rPr>
-        <w:t xml:space="preserve"> link command to see / inspect the bridge</w:t>
+        <w:t>b) Using bridge or ip link command to see / inspect the bridge</w:t>
       </w:r>
     </w:p>
     <w:p>
@@ -6914,6 +5561,7 @@
       <w:r>
         <w:rPr>
           <w:rFonts w:ascii="Arial" w:eastAsia="Times New Roman" w:hAnsi="Arial" w:cs="Arial"/>
+          <w:noProof/>
           <w:kern w:val="0"/>
           <w14:ligatures w14:val="none"/>
         </w:rPr>
@@ -6952,6 +5600,370 @@
             </a:graphic>
           </wp:inline>
         </w:drawing>
+      </w:r>
+    </w:p>
+    <w:p>
+      <w:pPr>
+        <w:spacing w:before="100" w:beforeAutospacing="1" w:after="100" w:afterAutospacing="1" w:line="480" w:lineRule="auto"/>
+        <w:rPr>
+          <w:rFonts w:ascii="Arial" w:eastAsia="Times New Roman" w:hAnsi="Arial" w:cs="Arial"/>
+          <w:kern w:val="0"/>
+          <w14:ligatures w14:val="none"/>
+        </w:rPr>
+      </w:pPr>
+      <w:r>
+        <w:rPr>
+          <w:rFonts w:ascii="Arial" w:eastAsia="Times New Roman" w:hAnsi="Arial" w:cs="Arial"/>
+          <w:kern w:val="0"/>
+          <w14:ligatures w14:val="none"/>
+        </w:rPr>
+        <w:lastRenderedPageBreak/>
+        <w:t>5. Create a simple LAN network with 2 Linux machine connected via a switch</w:t>
+      </w:r>
+    </w:p>
+    <w:p>
+      <w:pPr>
+        <w:spacing w:before="100" w:beforeAutospacing="1" w:after="100" w:afterAutospacing="1" w:line="480" w:lineRule="auto"/>
+        <w:rPr>
+          <w:rFonts w:ascii="Arial" w:eastAsia="Times New Roman" w:hAnsi="Arial" w:cs="Arial"/>
+          <w:kern w:val="0"/>
+          <w14:ligatures w14:val="none"/>
+        </w:rPr>
+      </w:pPr>
+      <w:r>
+        <w:rPr>
+          <w:rFonts w:ascii="Arial" w:eastAsia="Times New Roman" w:hAnsi="Arial" w:cs="Arial"/>
+          <w:kern w:val="0"/>
+          <w14:ligatures w14:val="none"/>
+        </w:rPr>
+        <w:t>I have used GNS3 software for this simulation.</w:t>
+      </w:r>
+    </w:p>
+    <w:p>
+      <w:pPr>
+        <w:spacing w:before="100" w:beforeAutospacing="1" w:after="100" w:afterAutospacing="1" w:line="240" w:lineRule="auto"/>
+        <w:rPr>
+          <w:rFonts w:ascii="Arial" w:eastAsia="Times New Roman" w:hAnsi="Arial" w:cs="Arial"/>
+          <w:kern w:val="0"/>
+          <w14:ligatures w14:val="none"/>
+        </w:rPr>
+      </w:pPr>
+      <w:r>
+        <w:rPr>
+          <w:rFonts w:ascii="Arial" w:eastAsia="Times New Roman" w:hAnsi="Arial" w:cs="Arial"/>
+          <w:kern w:val="0"/>
+          <w14:ligatures w14:val="none"/>
+        </w:rPr>
+        <w:t>Created a small network topology with 2 PC’s and a switch</w:t>
+      </w:r>
+      <w:r>
+        <w:rPr>
+          <w:rFonts w:ascii="Arial" w:eastAsia="Times New Roman" w:hAnsi="Arial" w:cs="Arial"/>
+          <w:noProof/>
+          <w:kern w:val="0"/>
+          <w14:ligatures w14:val="none"/>
+        </w:rPr>
+        <w:drawing>
+          <wp:inline distT="0" distB="0" distL="0" distR="0">
+            <wp:extent cx="6521450" cy="3105150"/>
+            <wp:effectExtent l="0" t="0" r="0" b="0"/>
+            <wp:docPr id="1067938159" name="Picture 9"/>
+            <wp:cNvGraphicFramePr>
+              <a:graphicFrameLocks xmlns:a="http://schemas.openxmlformats.org/drawingml/2006/main" noChangeAspect="1"/>
+            </wp:cNvGraphicFramePr>
+            <a:graphic xmlns:a="http://schemas.openxmlformats.org/drawingml/2006/main">
+              <a:graphicData uri="http://schemas.openxmlformats.org/drawingml/2006/picture">
+                <pic:pic xmlns:pic="http://schemas.openxmlformats.org/drawingml/2006/picture">
+                  <pic:nvPicPr>
+                    <pic:cNvPr id="0" name="Picture 9"/>
+                    <pic:cNvPicPr>
+                      <a:picLocks noChangeAspect="1" noChangeArrowheads="1"/>
+                    </pic:cNvPicPr>
+                  </pic:nvPicPr>
+                  <pic:blipFill>
+                    <a:blip r:embed="rId38" cstate="print">
+                      <a:extLst>
+                        <a:ext uri="{28A0092B-C50C-407E-A947-70E740481C1C}">
+                          <a14:useLocalDpi xmlns:a14="http://schemas.microsoft.com/office/drawing/2010/main" val="0"/>
+                        </a:ext>
+                      </a:extLst>
+                    </a:blip>
+                    <a:srcRect/>
+                    <a:stretch>
+                      <a:fillRect/>
+                    </a:stretch>
+                  </pic:blipFill>
+                  <pic:spPr bwMode="auto">
+                    <a:xfrm>
+                      <a:off x="0" y="0"/>
+                      <a:ext cx="6521450" cy="3105150"/>
+                    </a:xfrm>
+                    <a:prstGeom prst="rect">
+                      <a:avLst/>
+                    </a:prstGeom>
+                    <a:noFill/>
+                    <a:ln>
+                      <a:noFill/>
+                    </a:ln>
+                  </pic:spPr>
+                </pic:pic>
+              </a:graphicData>
+            </a:graphic>
+          </wp:inline>
+        </w:drawing>
+      </w:r>
+    </w:p>
+    <w:p>
+      <w:pPr>
+        <w:spacing w:before="100" w:beforeAutospacing="1" w:after="100" w:afterAutospacing="1" w:line="240" w:lineRule="auto"/>
+        <w:rPr>
+          <w:rFonts w:ascii="Arial" w:eastAsia="Times New Roman" w:hAnsi="Arial" w:cs="Arial"/>
+          <w:kern w:val="0"/>
+          <w14:ligatures w14:val="none"/>
+        </w:rPr>
+      </w:pPr>
+      <w:r>
+        <w:rPr>
+          <w:rFonts w:ascii="Arial" w:eastAsia="Times New Roman" w:hAnsi="Arial" w:cs="Arial"/>
+          <w:kern w:val="0"/>
+          <w14:ligatures w14:val="none"/>
+        </w:rPr>
+        <w:t>Assign IPs to each PC</w:t>
+      </w:r>
+    </w:p>
+    <w:p>
+      <w:pPr>
+        <w:spacing w:before="100" w:beforeAutospacing="1" w:after="100" w:afterAutospacing="1" w:line="240" w:lineRule="auto"/>
+        <w:rPr>
+          <w:rFonts w:ascii="Arial" w:eastAsia="Times New Roman" w:hAnsi="Arial" w:cs="Arial"/>
+          <w:kern w:val="0"/>
+          <w14:ligatures w14:val="none"/>
+        </w:rPr>
+      </w:pPr>
+      <w:r>
+        <w:rPr>
+          <w:rFonts w:ascii="Arial" w:eastAsia="Times New Roman" w:hAnsi="Arial" w:cs="Arial"/>
+          <w:noProof/>
+          <w:kern w:val="0"/>
+          <w14:ligatures w14:val="none"/>
+        </w:rPr>
+        <w:drawing>
+          <wp:inline distT="0" distB="0" distL="0" distR="0">
+            <wp:extent cx="6511281" cy="3617844"/>
+            <wp:effectExtent l="0" t="0" r="4445" b="1905"/>
+            <wp:docPr id="605299531" name="Picture 10"/>
+            <wp:cNvGraphicFramePr>
+              <a:graphicFrameLocks xmlns:a="http://schemas.openxmlformats.org/drawingml/2006/main" noChangeAspect="1"/>
+            </wp:cNvGraphicFramePr>
+            <a:graphic xmlns:a="http://schemas.openxmlformats.org/drawingml/2006/main">
+              <a:graphicData uri="http://schemas.openxmlformats.org/drawingml/2006/picture">
+                <pic:pic xmlns:pic="http://schemas.openxmlformats.org/drawingml/2006/picture">
+                  <pic:nvPicPr>
+                    <pic:cNvPr id="0" name="Picture 10"/>
+                    <pic:cNvPicPr>
+                      <a:picLocks noChangeAspect="1" noChangeArrowheads="1"/>
+                    </pic:cNvPicPr>
+                  </pic:nvPicPr>
+                  <pic:blipFill>
+                    <a:blip r:embed="rId39" cstate="print">
+                      <a:extLst>
+                        <a:ext uri="{28A0092B-C50C-407E-A947-70E740481C1C}">
+                          <a14:useLocalDpi xmlns:a14="http://schemas.microsoft.com/office/drawing/2010/main" val="0"/>
+                        </a:ext>
+                      </a:extLst>
+                    </a:blip>
+                    <a:srcRect/>
+                    <a:stretch>
+                      <a:fillRect/>
+                    </a:stretch>
+                  </pic:blipFill>
+                  <pic:spPr bwMode="auto">
+                    <a:xfrm>
+                      <a:off x="0" y="0"/>
+                      <a:ext cx="6511281" cy="3617844"/>
+                    </a:xfrm>
+                    <a:prstGeom prst="rect">
+                      <a:avLst/>
+                    </a:prstGeom>
+                    <a:noFill/>
+                    <a:ln>
+                      <a:noFill/>
+                    </a:ln>
+                  </pic:spPr>
+                </pic:pic>
+              </a:graphicData>
+            </a:graphic>
+          </wp:inline>
+        </w:drawing>
+      </w:r>
+    </w:p>
+    <w:p>
+      <w:pPr>
+        <w:spacing w:before="100" w:beforeAutospacing="1" w:after="100" w:afterAutospacing="1" w:line="240" w:lineRule="auto"/>
+        <w:rPr>
+          <w:rFonts w:ascii="Arial" w:eastAsia="Times New Roman" w:hAnsi="Arial" w:cs="Arial"/>
+          <w:kern w:val="0"/>
+          <w14:ligatures w14:val="none"/>
+        </w:rPr>
+      </w:pPr>
+      <w:r>
+        <w:rPr>
+          <w:rFonts w:ascii="Arial" w:eastAsia="Times New Roman" w:hAnsi="Arial" w:cs="Arial"/>
+          <w:noProof/>
+          <w:kern w:val="0"/>
+          <w14:ligatures w14:val="none"/>
+        </w:rPr>
+        <w:lastRenderedPageBreak/>
+        <w:drawing>
+          <wp:inline distT="0" distB="0" distL="0" distR="0">
+            <wp:extent cx="6519512" cy="3816626"/>
+            <wp:effectExtent l="0" t="0" r="0" b="0"/>
+            <wp:docPr id="384008551" name="Picture 12"/>
+            <wp:cNvGraphicFramePr>
+              <a:graphicFrameLocks xmlns:a="http://schemas.openxmlformats.org/drawingml/2006/main" noChangeAspect="1"/>
+            </wp:cNvGraphicFramePr>
+            <a:graphic xmlns:a="http://schemas.openxmlformats.org/drawingml/2006/main">
+              <a:graphicData uri="http://schemas.openxmlformats.org/drawingml/2006/picture">
+                <pic:pic xmlns:pic="http://schemas.openxmlformats.org/drawingml/2006/picture">
+                  <pic:nvPicPr>
+                    <pic:cNvPr id="0" name="Picture 12"/>
+                    <pic:cNvPicPr>
+                      <a:picLocks noChangeAspect="1" noChangeArrowheads="1"/>
+                    </pic:cNvPicPr>
+                  </pic:nvPicPr>
+                  <pic:blipFill>
+                    <a:blip r:embed="rId40">
+                      <a:extLst>
+                        <a:ext uri="{28A0092B-C50C-407E-A947-70E740481C1C}">
+                          <a14:useLocalDpi xmlns:a14="http://schemas.microsoft.com/office/drawing/2010/main" val="0"/>
+                        </a:ext>
+                      </a:extLst>
+                    </a:blip>
+                    <a:srcRect/>
+                    <a:stretch>
+                      <a:fillRect/>
+                    </a:stretch>
+                  </pic:blipFill>
+                  <pic:spPr bwMode="auto">
+                    <a:xfrm>
+                      <a:off x="0" y="0"/>
+                      <a:ext cx="6559991" cy="3840323"/>
+                    </a:xfrm>
+                    <a:prstGeom prst="rect">
+                      <a:avLst/>
+                    </a:prstGeom>
+                    <a:noFill/>
+                    <a:ln>
+                      <a:noFill/>
+                    </a:ln>
+                  </pic:spPr>
+                </pic:pic>
+              </a:graphicData>
+            </a:graphic>
+          </wp:inline>
+        </w:drawing>
+      </w:r>
+    </w:p>
+    <w:p>
+      <w:pPr>
+        <w:spacing w:before="100" w:beforeAutospacing="1" w:after="100" w:afterAutospacing="1" w:line="240" w:lineRule="auto"/>
+        <w:rPr>
+          <w:rFonts w:ascii="Arial" w:eastAsia="Times New Roman" w:hAnsi="Arial" w:cs="Arial"/>
+          <w:kern w:val="0"/>
+          <w14:ligatures w14:val="none"/>
+        </w:rPr>
+      </w:pPr>
+      <w:r>
+        <w:rPr>
+          <w:rFonts w:ascii="Arial" w:eastAsia="Times New Roman" w:hAnsi="Arial" w:cs="Arial"/>
+          <w:kern w:val="0"/>
+          <w14:ligatures w14:val="none"/>
+        </w:rPr>
+        <w:t>Ping one system from the other</w:t>
+      </w:r>
+    </w:p>
+    <w:p>
+      <w:pPr>
+        <w:spacing w:before="100" w:beforeAutospacing="1" w:after="100" w:afterAutospacing="1" w:line="240" w:lineRule="auto"/>
+        <w:rPr>
+          <w:rFonts w:ascii="Arial" w:eastAsia="Times New Roman" w:hAnsi="Arial" w:cs="Arial"/>
+          <w:kern w:val="0"/>
+          <w14:ligatures w14:val="none"/>
+        </w:rPr>
+      </w:pPr>
+      <w:r>
+        <w:rPr>
+          <w:rFonts w:ascii="Arial" w:eastAsia="Times New Roman" w:hAnsi="Arial" w:cs="Arial"/>
+          <w:noProof/>
+          <w:kern w:val="0"/>
+          <w14:ligatures w14:val="none"/>
+        </w:rPr>
+        <w:drawing>
+          <wp:inline distT="0" distB="0" distL="0" distR="0">
+            <wp:extent cx="6520180" cy="3665855"/>
+            <wp:effectExtent l="0" t="0" r="0" b="0"/>
+            <wp:docPr id="1500927095" name="Picture 13"/>
+            <wp:cNvGraphicFramePr>
+              <a:graphicFrameLocks xmlns:a="http://schemas.openxmlformats.org/drawingml/2006/main" noChangeAspect="1"/>
+            </wp:cNvGraphicFramePr>
+            <a:graphic xmlns:a="http://schemas.openxmlformats.org/drawingml/2006/main">
+              <a:graphicData uri="http://schemas.openxmlformats.org/drawingml/2006/picture">
+                <pic:pic xmlns:pic="http://schemas.openxmlformats.org/drawingml/2006/picture">
+                  <pic:nvPicPr>
+                    <pic:cNvPr id="0" name="Picture 13"/>
+                    <pic:cNvPicPr>
+                      <a:picLocks noChangeAspect="1" noChangeArrowheads="1"/>
+                    </pic:cNvPicPr>
+                  </pic:nvPicPr>
+                  <pic:blipFill>
+                    <a:blip r:embed="rId41" cstate="print">
+                      <a:extLst>
+                        <a:ext uri="{28A0092B-C50C-407E-A947-70E740481C1C}">
+                          <a14:useLocalDpi xmlns:a14="http://schemas.microsoft.com/office/drawing/2010/main" val="0"/>
+                        </a:ext>
+                      </a:extLst>
+                    </a:blip>
+                    <a:srcRect/>
+                    <a:stretch>
+                      <a:fillRect/>
+                    </a:stretch>
+                  </pic:blipFill>
+                  <pic:spPr bwMode="auto">
+                    <a:xfrm>
+                      <a:off x="0" y="0"/>
+                      <a:ext cx="6520180" cy="3665855"/>
+                    </a:xfrm>
+                    <a:prstGeom prst="rect">
+                      <a:avLst/>
+                    </a:prstGeom>
+                    <a:noFill/>
+                    <a:ln>
+                      <a:noFill/>
+                    </a:ln>
+                  </pic:spPr>
+                </pic:pic>
+              </a:graphicData>
+            </a:graphic>
+          </wp:inline>
+        </w:drawing>
+      </w:r>
+    </w:p>
+    <w:p>
+      <w:pPr>
+        <w:spacing w:before="100" w:beforeAutospacing="1" w:after="100" w:afterAutospacing="1" w:line="480" w:lineRule="auto"/>
+        <w:rPr>
+          <w:rFonts w:ascii="Arial" w:eastAsia="Times New Roman" w:hAnsi="Arial" w:cs="Arial"/>
+          <w:kern w:val="0"/>
+          <w14:ligatures w14:val="none"/>
+        </w:rPr>
+      </w:pPr>
+      <w:r>
+        <w:rPr>
+          <w:rFonts w:ascii="Arial" w:eastAsia="Times New Roman" w:hAnsi="Arial" w:cs="Arial"/>
+          <w:kern w:val="0"/>
+          <w14:ligatures w14:val="none"/>
+        </w:rPr>
+        <w:t xml:space="preserve"> </w:t>
       </w:r>
     </w:p>
     <w:sectPr>

</xml_diff>